<commit_message>
Checkpoint final user dissertation edits
</commit_message>
<xml_diff>
--- a/论文对比资料_2026-08-23/21_用户修订图表补全_2026-08-28/output/行为树论文_中文_用户修订图表补全版_2026-08-28.docx
+++ b/论文对比资料_2026-08-23/21_用户修订图表补全_2026-08-28/output/行为树论文_中文_用户修订图表补全版_2026-08-28.docx
@@ -57,21 +57,30 @@
       </w:pPr>
       <w:r>
         <w:rPr>
-          <w:rFonts w:ascii="Arial" w:eastAsia="黑体" w:hAnsi="Arial"/>
+          <w:rFonts w:ascii="Arial" w:eastAsia="黑体" w:hAnsi="Arial" w:hint="eastAsia"/>
           <w:b/>
           <w:sz w:val="48"/>
           <w:lang w:eastAsia="zh-CN"/>
         </w:rPr>
-        <w:t xml:space="preserve">Godot 4.6 </w:t>
-      </w:r>
-      <w:r>
-        <w:rPr>
-          <w:rFonts w:ascii="Arial" w:eastAsia="黑体" w:hAnsi="Arial"/>
+        <w:t>基于</w:t>
+      </w:r>
+      <w:r>
+        <w:rPr>
+          <w:rFonts w:ascii="Arial" w:eastAsia="黑体" w:hAnsi="Arial" w:hint="eastAsia"/>
           <w:b/>
           <w:sz w:val="48"/>
           <w:lang w:eastAsia="zh-CN"/>
         </w:rPr>
-        <w:t>大型可视化行为树的显示优化与实验评估</w:t>
+        <w:t>godot</w:t>
+      </w:r>
+      <w:r>
+        <w:rPr>
+          <w:rFonts w:ascii="Arial" w:eastAsia="黑体" w:hAnsi="Arial" w:hint="eastAsia"/>
+          <w:b/>
+          <w:sz w:val="48"/>
+          <w:lang w:eastAsia="zh-CN"/>
+        </w:rPr>
+        <w:t>的可视化行为树插件与显示优化</w:t>
       </w:r>
     </w:p>
     <w:p>
@@ -98,10 +107,11 @@
       </w:r>
       <w:r>
         <w:rPr>
+          <w:rFonts w:hint="eastAsia"/>
           <w:sz w:val="26"/>
           <w:lang w:eastAsia="zh-CN"/>
         </w:rPr>
-        <w:t>作者姓名</w:t>
+        <w:t>吕嘉晨</w:t>
       </w:r>
       <w:r>
         <w:rPr>
@@ -175,7 +185,11 @@
         <w:t>: [</w:t>
       </w:r>
       <w:r>
-        <w:t>学号</w:t>
+        <w:rPr>
+          <w:rFonts w:hint="eastAsia"/>
+          <w:lang w:eastAsia="zh-CN"/>
+        </w:rPr>
+        <w:t>5613244</w:t>
       </w:r>
       <w:r>
         <w:t>]</w:t>
@@ -6510,7 +6524,7 @@
         <w:rPr>
           <w:lang w:eastAsia="zh-CN"/>
         </w:rPr>
-        <w:t>本论文作为本人申请游戏工程理学硕士学位的材料提交给华威大学。论文由本人完成，且未曾用于申请其他学位。除明确引用的资料外，本文所述软件、测试数据和分析均来自本项目。本文没有报告任何参与者实验结果。正式提交前，作者必须根据学校规定审阅并个性化本声明，包括如实说明生成式人工智能的使用方式。</w:t>
+        <w:t>本论文作为本人申请游戏工程理学硕士学位的材料提交给华威大学。论文由本人完成，且未曾用于申请其他学位。除明确引用的资料外，本文所述软件、测试数据和分析均来自本项目。</w:t>
       </w:r>
     </w:p>
     <w:p>
@@ -14598,34 +14612,42 @@
           <w:p>
             <w:pPr>
               <w:spacing w:line="252" w:lineRule="auto"/>
+              <w:rPr>
+                <w:lang w:eastAsia="zh-CN"/>
+              </w:rPr>
             </w:pPr>
             <w:r>
               <w:rPr>
                 <w:sz w:val="17"/>
+                <w:lang w:eastAsia="zh-CN"/>
               </w:rPr>
               <w:t>45</w:t>
             </w:r>
             <w:r>
               <w:rPr>
                 <w:sz w:val="17"/>
+                <w:lang w:eastAsia="zh-CN"/>
               </w:rPr>
               <w:t>组测试中的拖动重叠都被消除；平均移动</w:t>
             </w:r>
             <w:r>
               <w:rPr>
                 <w:sz w:val="17"/>
+                <w:lang w:eastAsia="zh-CN"/>
               </w:rPr>
               <w:t>2.40</w:t>
             </w:r>
             <w:r>
               <w:rPr>
                 <w:sz w:val="17"/>
+                <w:lang w:eastAsia="zh-CN"/>
               </w:rPr>
               <w:t>张周围卡片，平均总移动距离为</w:t>
             </w:r>
             <w:r>
               <w:rPr>
                 <w:sz w:val="17"/>
+                <w:lang w:eastAsia="zh-CN"/>
               </w:rPr>
               <w:t>375.90 px</w:t>
             </w:r>
@@ -14640,10 +14662,14 @@
           <w:p>
             <w:pPr>
               <w:spacing w:line="252" w:lineRule="auto"/>
+              <w:rPr>
+                <w:lang w:eastAsia="zh-CN"/>
+              </w:rPr>
             </w:pPr>
             <w:r>
               <w:rPr>
                 <w:sz w:val="17"/>
+                <w:lang w:eastAsia="zh-CN"/>
               </w:rPr>
               <w:t>能够处理拖动产生的节点遮挡</w:t>
             </w:r>
@@ -14658,10 +14684,14 @@
           <w:p>
             <w:pPr>
               <w:spacing w:line="252" w:lineRule="auto"/>
+              <w:rPr>
+                <w:lang w:eastAsia="zh-CN"/>
+              </w:rPr>
             </w:pPr>
             <w:r>
               <w:rPr>
                 <w:sz w:val="17"/>
+                <w:lang w:eastAsia="zh-CN"/>
               </w:rPr>
               <w:t>会带动少量周围卡片，用户需要接受局部位置变化</w:t>
             </w:r>
@@ -14702,28 +14732,35 @@
           <w:p>
             <w:pPr>
               <w:spacing w:line="252" w:lineRule="auto"/>
+              <w:rPr>
+                <w:lang w:eastAsia="zh-CN"/>
+              </w:rPr>
             </w:pPr>
             <w:r>
               <w:rPr>
                 <w:sz w:val="17"/>
+                <w:lang w:eastAsia="zh-CN"/>
               </w:rPr>
               <w:t>卡片面积平均减少</w:t>
             </w:r>
             <w:r>
               <w:rPr>
                 <w:sz w:val="17"/>
+                <w:lang w:eastAsia="zh-CN"/>
               </w:rPr>
               <w:t>45.14%</w:t>
             </w:r>
             <w:r>
               <w:rPr>
                 <w:sz w:val="17"/>
+                <w:lang w:eastAsia="zh-CN"/>
               </w:rPr>
               <w:t>，字段平均减少</w:t>
             </w:r>
             <w:r>
               <w:rPr>
                 <w:sz w:val="17"/>
+                <w:lang w:eastAsia="zh-CN"/>
               </w:rPr>
               <w:t>43.61%</w:t>
             </w:r>
@@ -14738,10 +14775,14 @@
           <w:p>
             <w:pPr>
               <w:spacing w:line="252" w:lineRule="auto"/>
+              <w:rPr>
+                <w:lang w:eastAsia="zh-CN"/>
+              </w:rPr>
             </w:pPr>
             <w:r>
               <w:rPr>
                 <w:sz w:val="17"/>
+                <w:lang w:eastAsia="zh-CN"/>
               </w:rPr>
               <w:t>缩小时可以减少画面占用</w:t>
             </w:r>
@@ -14756,10 +14797,14 @@
           <w:p>
             <w:pPr>
               <w:spacing w:line="252" w:lineRule="auto"/>
+              <w:rPr>
+                <w:lang w:eastAsia="zh-CN"/>
+              </w:rPr>
             </w:pPr>
             <w:r>
               <w:rPr>
                 <w:sz w:val="17"/>
+                <w:lang w:eastAsia="zh-CN"/>
               </w:rPr>
               <w:t>部分文字会暂时隐藏，需要放大后查看细节</w:t>
             </w:r>
@@ -14799,34 +14844,42 @@
           <w:p>
             <w:pPr>
               <w:spacing w:line="252" w:lineRule="auto"/>
+              <w:rPr>
+                <w:lang w:eastAsia="zh-CN"/>
+              </w:rPr>
             </w:pPr>
             <w:r>
               <w:rPr>
                 <w:sz w:val="17"/>
+                <w:lang w:eastAsia="zh-CN"/>
               </w:rPr>
               <w:t>平均每个测试画面中有</w:t>
             </w:r>
             <w:r>
               <w:rPr>
                 <w:sz w:val="17"/>
+                <w:lang w:eastAsia="zh-CN"/>
               </w:rPr>
               <w:t>3.62</w:t>
             </w:r>
             <w:r>
               <w:rPr>
                 <w:sz w:val="17"/>
+                <w:lang w:eastAsia="zh-CN"/>
               </w:rPr>
               <w:t>条可见连线受到非端点卡片遮挡；开启后卡片背景调整为</w:t>
             </w:r>
             <w:r>
               <w:rPr>
                 <w:sz w:val="17"/>
+                <w:lang w:eastAsia="zh-CN"/>
               </w:rPr>
               <w:t>72%</w:t>
             </w:r>
             <w:r>
               <w:rPr>
                 <w:sz w:val="17"/>
+                <w:lang w:eastAsia="zh-CN"/>
               </w:rPr>
               <w:t>不透明</w:t>
             </w:r>
@@ -14841,10 +14894,14 @@
           <w:p>
             <w:pPr>
               <w:spacing w:line="252" w:lineRule="auto"/>
+              <w:rPr>
+                <w:lang w:eastAsia="zh-CN"/>
+              </w:rPr>
             </w:pPr>
             <w:r>
               <w:rPr>
                 <w:sz w:val="17"/>
+                <w:lang w:eastAsia="zh-CN"/>
               </w:rPr>
               <w:t>被卡片挡住的连线能够部分显示</w:t>
             </w:r>
@@ -14859,10 +14916,14 @@
           <w:p>
             <w:pPr>
               <w:spacing w:line="252" w:lineRule="auto"/>
+              <w:rPr>
+                <w:lang w:eastAsia="zh-CN"/>
+              </w:rPr>
             </w:pPr>
             <w:r>
               <w:rPr>
                 <w:sz w:val="17"/>
+                <w:lang w:eastAsia="zh-CN"/>
               </w:rPr>
               <w:t>只改善局部连线可见性，不会降低整体拥挤程度</w:t>
             </w:r>
@@ -14902,22 +14963,28 @@
           <w:p>
             <w:pPr>
               <w:spacing w:line="252" w:lineRule="auto"/>
+              <w:rPr>
+                <w:lang w:eastAsia="zh-CN"/>
+              </w:rPr>
             </w:pPr>
             <w:r>
               <w:rPr>
                 <w:sz w:val="17"/>
+                <w:lang w:eastAsia="zh-CN"/>
               </w:rPr>
               <w:t>全亮候选节点平均减少</w:t>
             </w:r>
             <w:r>
               <w:rPr>
                 <w:sz w:val="17"/>
+                <w:lang w:eastAsia="zh-CN"/>
               </w:rPr>
               <w:t>58.51%</w:t>
             </w:r>
             <w:r>
               <w:rPr>
                 <w:sz w:val="17"/>
+                <w:lang w:eastAsia="zh-CN"/>
               </w:rPr>
               <w:t>，无关节点被统一淡化</w:t>
             </w:r>
@@ -14932,10 +14999,14 @@
           <w:p>
             <w:pPr>
               <w:spacing w:line="252" w:lineRule="auto"/>
+              <w:rPr>
+                <w:lang w:eastAsia="zh-CN"/>
+              </w:rPr>
             </w:pPr>
             <w:r>
               <w:rPr>
                 <w:sz w:val="17"/>
+                <w:lang w:eastAsia="zh-CN"/>
               </w:rPr>
               <w:t>能够突出选中节点及其相关结构</w:t>
             </w:r>
@@ -14950,10 +15021,14 @@
           <w:p>
             <w:pPr>
               <w:spacing w:line="252" w:lineRule="auto"/>
+              <w:rPr>
+                <w:lang w:eastAsia="zh-CN"/>
+              </w:rPr>
             </w:pPr>
             <w:r>
               <w:rPr>
                 <w:sz w:val="17"/>
+                <w:lang w:eastAsia="zh-CN"/>
               </w:rPr>
               <w:t>不方便同时比较无关分支</w:t>
             </w:r>
@@ -14993,28 +15068,35 @@
           <w:p>
             <w:pPr>
               <w:spacing w:line="252" w:lineRule="auto"/>
+              <w:rPr>
+                <w:lang w:eastAsia="zh-CN"/>
+              </w:rPr>
             </w:pPr>
             <w:r>
               <w:rPr>
                 <w:sz w:val="17"/>
+                <w:lang w:eastAsia="zh-CN"/>
               </w:rPr>
               <w:t>目标节点平均宽度由</w:t>
             </w:r>
             <w:r>
               <w:rPr>
                 <w:sz w:val="17"/>
+                <w:lang w:eastAsia="zh-CN"/>
               </w:rPr>
               <w:t>119.43 px</w:t>
             </w:r>
             <w:r>
               <w:rPr>
                 <w:sz w:val="17"/>
+                <w:lang w:eastAsia="zh-CN"/>
               </w:rPr>
               <w:t>增加到</w:t>
             </w:r>
             <w:r>
               <w:rPr>
                 <w:sz w:val="17"/>
+                <w:lang w:eastAsia="zh-CN"/>
               </w:rPr>
               <w:t>224.55 px</w:t>
             </w:r>
@@ -15029,10 +15111,14 @@
           <w:p>
             <w:pPr>
               <w:spacing w:line="252" w:lineRule="auto"/>
+              <w:rPr>
+                <w:lang w:eastAsia="zh-CN"/>
+              </w:rPr>
             </w:pPr>
             <w:r>
               <w:rPr>
                 <w:sz w:val="17"/>
+                <w:lang w:eastAsia="zh-CN"/>
               </w:rPr>
               <w:t>缩小后仍能临时查看局部节点</w:t>
             </w:r>
@@ -15047,10 +15133,14 @@
           <w:p>
             <w:pPr>
               <w:spacing w:line="252" w:lineRule="auto"/>
+              <w:rPr>
+                <w:lang w:eastAsia="zh-CN"/>
+              </w:rPr>
             </w:pPr>
             <w:r>
               <w:rPr>
                 <w:sz w:val="17"/>
+                <w:lang w:eastAsia="zh-CN"/>
               </w:rPr>
               <w:t>部分测试出现新的局部重叠和层级遮挡</w:t>
             </w:r>
@@ -15250,12 +15340,21 @@
         </w:rPr>
       </w:pPr>
       <w:r>
+        <w:rPr>
+          <w:lang w:eastAsia="zh-CN"/>
+        </w:rPr>
         <w:t>图</w:t>
       </w:r>
       <w:r>
+        <w:rPr>
+          <w:lang w:eastAsia="zh-CN"/>
+        </w:rPr>
         <w:t>5.1</w:t>
       </w:r>
       <w:r>
+        <w:rPr>
+          <w:lang w:eastAsia="zh-CN"/>
+        </w:rPr>
         <w:t>比较了节点被拖到同一位置时，功能开启前后的画面。开启后，系统会移动周围节点来避免重叠。有时为了保持原来的树形结构，同一组中距离较远的节点也会一起移动。因此，智能重排只会限制受影响的范围，但不一定只移动离拖动位置最近的节点。</w:t>
       </w:r>
     </w:p>
@@ -17774,24 +17873,45 @@
         </w:rPr>
       </w:pPr>
       <w:r>
+        <w:rPr>
+          <w:lang w:eastAsia="zh-CN"/>
+        </w:rPr>
         <w:t>表</w:t>
       </w:r>
       <w:r>
+        <w:rPr>
+          <w:lang w:eastAsia="zh-CN"/>
+        </w:rPr>
         <w:t xml:space="preserve"> 5.4 </w:t>
       </w:r>
       <w:r>
+        <w:rPr>
+          <w:lang w:eastAsia="zh-CN"/>
+        </w:rPr>
         <w:t>显示，小屏幕并不是让所有功能都更有效。</w:t>
       </w:r>
       <w:r>
+        <w:rPr>
+          <w:lang w:eastAsia="zh-CN"/>
+        </w:rPr>
         <w:t xml:space="preserve">Adaptive </w:t>
       </w:r>
       <w:r>
+        <w:rPr>
+          <w:lang w:eastAsia="zh-CN"/>
+        </w:rPr>
         <w:t>和</w:t>
       </w:r>
       <w:r>
+        <w:rPr>
+          <w:lang w:eastAsia="zh-CN"/>
+        </w:rPr>
         <w:t xml:space="preserve"> Fisheye </w:t>
       </w:r>
       <w:r>
+        <w:rPr>
+          <w:lang w:eastAsia="zh-CN"/>
+        </w:rPr>
         <w:t>在小屏幕中的相对作用最明显，因为小屏幕中的概览必须把行为树缩得更小。</w:t>
       </w:r>
       <w:r>
@@ -17899,27 +18019,53 @@
       <w:bookmarkEnd w:id="63"/>
     </w:p>
     <w:p>
-      <w:r>
+      <w:pPr>
+        <w:rPr>
+          <w:lang w:eastAsia="zh-CN"/>
+        </w:rPr>
+      </w:pPr>
+      <w:r>
+        <w:rPr>
+          <w:lang w:eastAsia="zh-CN"/>
+        </w:rPr>
         <w:t>在自动数据之外，本项目还按照固定问题对每项显示优化功能进行了实际使用评价。评价问题包括：该功能主要帮助完成什么操作，开启后是否更容易查看或编辑行为树，使用过程中出现了什么问题，该功能更适合哪种行为树规模，以及该功能更适合哪种屏幕尺寸。表</w:t>
       </w:r>
       <w:r>
+        <w:rPr>
+          <w:lang w:eastAsia="zh-CN"/>
+        </w:rPr>
         <w:t xml:space="preserve"> 5.5 </w:t>
       </w:r>
       <w:r>
+        <w:rPr>
+          <w:lang w:eastAsia="zh-CN"/>
+        </w:rPr>
         <w:t>记录了对应结果。</w:t>
       </w:r>
     </w:p>
     <w:p>
       <w:pPr>
         <w:pStyle w:val="TableCaption"/>
-      </w:pPr>
-      <w:r>
+        <w:rPr>
+          <w:lang w:eastAsia="zh-CN"/>
+        </w:rPr>
+      </w:pPr>
+      <w:r>
+        <w:rPr>
+          <w:lang w:eastAsia="zh-CN"/>
+        </w:rPr>
         <w:t>表</w:t>
       </w:r>
       <w:r>
+        <w:rPr>
+          <w:lang w:eastAsia="zh-CN"/>
+        </w:rPr>
         <w:t xml:space="preserve"> 5.5</w:t>
       </w:r>
       <w:r>
+        <w:rPr>
+          <w:lang w:eastAsia="zh-CN"/>
+        </w:rPr>
         <w:t xml:space="preserve">　结构化开发者评价结果</w:t>
       </w:r>
     </w:p>
@@ -18087,12 +18233,16 @@
           <w:p>
             <w:pPr>
               <w:spacing w:line="252" w:lineRule="auto"/>
+              <w:rPr>
+                <w:lang w:eastAsia="zh-CN"/>
+              </w:rPr>
             </w:pPr>
             <w:r>
               <w:rPr>
                 <w:sz w:val="17"/>
-              </w:rPr>
-              <w:t>拖动节点和整理局部分支，避免刚移动后卡片互相遮挡</w:t>
+                <w:lang w:eastAsia="zh-CN"/>
+              </w:rPr>
+              <w:t>拖动节点和整理局部分支，避免移动后卡片互相遮挡</w:t>
             </w:r>
           </w:p>
         </w:tc>
@@ -18104,12 +18254,25 @@
           <w:p>
             <w:pPr>
               <w:spacing w:line="252" w:lineRule="auto"/>
+              <w:rPr>
+                <w:rFonts w:hint="eastAsia"/>
+                <w:lang w:eastAsia="zh-CN"/>
+              </w:rPr>
             </w:pPr>
             <w:r>
               <w:rPr>
-                <w:sz w:val="17"/>
-              </w:rPr>
-              <w:t>对编辑帮助直接，尤其适合需要反复调整节点位置时使用</w:t>
+                <w:rFonts w:hint="eastAsia"/>
+                <w:lang w:eastAsia="zh-CN"/>
+              </w:rPr>
+              <w:t>在节点密集区域进行编辑时，有效的减少了因为重叠而调整其</w:t>
+            </w:r>
+            <w:r>
+              <w:rPr>
+                <w:rFonts w:hint="eastAsia"/>
+                <w:lang w:eastAsia="zh-CN"/>
+              </w:rPr>
+              <w:lastRenderedPageBreak/>
+              <w:t>他节点消耗的时间。</w:t>
             </w:r>
           </w:p>
         </w:tc>
@@ -18121,12 +18284,28 @@
           <w:p>
             <w:pPr>
               <w:spacing w:line="252" w:lineRule="auto"/>
+              <w:rPr>
+                <w:rFonts w:hint="eastAsia"/>
+                <w:lang w:eastAsia="zh-CN"/>
+              </w:rPr>
             </w:pPr>
             <w:r>
               <w:rPr>
+                <w:rFonts w:hint="eastAsia"/>
                 <w:sz w:val="17"/>
-              </w:rPr>
-              <w:t>有时会带动同组中较远的节点一起移动</w:t>
+                <w:lang w:eastAsia="zh-CN"/>
+              </w:rPr>
+              <w:lastRenderedPageBreak/>
+              <w:t>对于周边节点的避障功能并不稳定，有时会因为重拍导致周边节点出现较大的位移，导致使用者需要</w:t>
+            </w:r>
+            <w:r>
+              <w:rPr>
+                <w:rFonts w:hint="eastAsia"/>
+                <w:sz w:val="17"/>
+                <w:lang w:eastAsia="zh-CN"/>
+              </w:rPr>
+              <w:lastRenderedPageBreak/>
+              <w:t>重新记忆周边节点位置。</w:t>
             </w:r>
           </w:p>
         </w:tc>
@@ -18138,12 +18317,32 @@
           <w:p>
             <w:pPr>
               <w:spacing w:line="252" w:lineRule="auto"/>
+              <w:rPr>
+                <w:rFonts w:hint="eastAsia"/>
+                <w:lang w:eastAsia="zh-CN"/>
+              </w:rPr>
             </w:pPr>
             <w:r>
               <w:rPr>
-                <w:sz w:val="17"/>
-              </w:rPr>
-              <w:t>中型到大型树更明显，小树收益较少</w:t>
+                <w:rFonts w:hint="eastAsia"/>
+                <w:lang w:eastAsia="zh-CN"/>
+              </w:rPr>
+              <w:lastRenderedPageBreak/>
+              <w:t>中大型的行为树更容易出现节点密集的情况，该功能更适</w:t>
+            </w:r>
+            <w:r>
+              <w:rPr>
+                <w:rFonts w:hint="eastAsia"/>
+                <w:lang w:eastAsia="zh-CN"/>
+              </w:rPr>
+              <w:lastRenderedPageBreak/>
+              <w:t>配。</w:t>
+            </w:r>
+            <w:r>
+              <w:rPr>
+                <w:lang w:eastAsia="zh-CN"/>
+              </w:rPr>
+              <w:br/>
             </w:r>
           </w:p>
         </w:tc>
@@ -18155,12 +18354,26 @@
           <w:p>
             <w:pPr>
               <w:spacing w:line="252" w:lineRule="auto"/>
+              <w:rPr>
+                <w:rFonts w:hint="eastAsia"/>
+                <w:lang w:eastAsia="zh-CN"/>
+              </w:rPr>
             </w:pPr>
             <w:r>
               <w:rPr>
-                <w:sz w:val="17"/>
-              </w:rPr>
-              <w:t>三种屏幕都适合，屏幕尺寸影响不大</w:t>
+                <w:rFonts w:hint="eastAsia"/>
+                <w:lang w:eastAsia="zh-CN"/>
+              </w:rPr>
+              <w:lastRenderedPageBreak/>
+              <w:t>大屏幕下因为能够显示更多节点，可以第一时间观察到自动重</w:t>
+            </w:r>
+            <w:r>
+              <w:rPr>
+                <w:rFonts w:hint="eastAsia"/>
+                <w:lang w:eastAsia="zh-CN"/>
+              </w:rPr>
+              <w:lastRenderedPageBreak/>
+              <w:t>拍导致的其他节点的位置变化，更方便使用者建立新的记忆。</w:t>
             </w:r>
           </w:p>
         </w:tc>
@@ -18195,19 +18408,16 @@
           <w:p>
             <w:pPr>
               <w:spacing w:line="252" w:lineRule="auto"/>
+              <w:rPr>
+                <w:lang w:eastAsia="zh-CN"/>
+              </w:rPr>
             </w:pPr>
             <w:r>
               <w:rPr>
                 <w:sz w:val="17"/>
-              </w:rPr>
-              <w:t>缩小时减少卡片面积和字段数</w:t>
-            </w:r>
-            <w:r>
-              <w:rPr>
-                <w:sz w:val="17"/>
-              </w:rPr>
-              <w:lastRenderedPageBreak/>
-              <w:t>量，方便先看整体结构</w:t>
+                <w:lang w:eastAsia="zh-CN"/>
+              </w:rPr>
+              <w:t>缩小时减少卡片面积和字段数量，方便先看整体结构</w:t>
             </w:r>
           </w:p>
         </w:tc>
@@ -18219,20 +18429,18 @@
           <w:p>
             <w:pPr>
               <w:spacing w:line="252" w:lineRule="auto"/>
+              <w:rPr>
+                <w:rFonts w:hint="eastAsia"/>
+                <w:lang w:eastAsia="zh-CN"/>
+              </w:rPr>
             </w:pPr>
             <w:r>
               <w:rPr>
+                <w:rFonts w:hint="eastAsia"/>
                 <w:sz w:val="17"/>
-              </w:rPr>
-              <w:lastRenderedPageBreak/>
-              <w:t>对查看全局帮助最大，也能减</w:t>
-            </w:r>
-            <w:r>
-              <w:rPr>
-                <w:sz w:val="17"/>
-              </w:rPr>
-              <w:lastRenderedPageBreak/>
-              <w:t>少缩放后的拥挤感</w:t>
+                <w:lang w:eastAsia="zh-CN"/>
+              </w:rPr>
+              <w:t>在缩小后因为卡片面积的减少，是的整个树的结构能够更清楚的被观察。</w:t>
             </w:r>
           </w:p>
         </w:tc>
@@ -18244,20 +18452,18 @@
           <w:p>
             <w:pPr>
               <w:spacing w:line="252" w:lineRule="auto"/>
+              <w:rPr>
+                <w:rFonts w:hint="eastAsia"/>
+                <w:lang w:eastAsia="zh-CN"/>
+              </w:rPr>
             </w:pPr>
             <w:r>
               <w:rPr>
+                <w:rFonts w:hint="eastAsia"/>
                 <w:sz w:val="17"/>
-              </w:rPr>
-              <w:lastRenderedPageBreak/>
-              <w:t>缩小时部分参数文字会隐藏，需</w:t>
-            </w:r>
-            <w:r>
-              <w:rPr>
-                <w:sz w:val="17"/>
-              </w:rPr>
-              <w:lastRenderedPageBreak/>
-              <w:t>要放大后再查看</w:t>
+                <w:lang w:eastAsia="zh-CN"/>
+              </w:rPr>
+              <w:t>缩小后部分参数被隐藏，可能会出现需要反复放大缩小来在观察全局的情况下对局部进行调整。</w:t>
             </w:r>
           </w:p>
         </w:tc>
@@ -18269,32 +18475,18 @@
           <w:p>
             <w:pPr>
               <w:spacing w:line="252" w:lineRule="auto"/>
+              <w:rPr>
+                <w:rFonts w:hint="eastAsia"/>
+                <w:lang w:eastAsia="zh-CN"/>
+              </w:rPr>
             </w:pPr>
             <w:r>
               <w:rPr>
+                <w:rFonts w:hint="eastAsia"/>
                 <w:sz w:val="17"/>
-              </w:rPr>
-              <w:lastRenderedPageBreak/>
-              <w:t>节点越多越有用，</w:t>
-            </w:r>
-            <w:r>
-              <w:rPr>
-                <w:sz w:val="17"/>
-              </w:rPr>
-              <w:t>121</w:t>
-            </w:r>
-            <w:r>
-              <w:rPr>
-                <w:sz w:val="17"/>
-              </w:rPr>
-              <w:t>节点以上更</w:t>
-            </w:r>
-            <w:r>
-              <w:rPr>
-                <w:sz w:val="17"/>
-              </w:rPr>
-              <w:lastRenderedPageBreak/>
-              <w:t>明显</w:t>
+                <w:lang w:eastAsia="zh-CN"/>
+              </w:rPr>
+              <w:t>小型行为树因为节点数量小，即便在缩小后也能清晰的观察，导致该功能在小型行为树上可能因为隐藏部分信息起到反效果，在大型行为树上有较好的表现。</w:t>
             </w:r>
           </w:p>
         </w:tc>
@@ -18306,20 +18498,18 @@
           <w:p>
             <w:pPr>
               <w:spacing w:line="252" w:lineRule="auto"/>
+              <w:rPr>
+                <w:rFonts w:hint="eastAsia"/>
+                <w:lang w:eastAsia="zh-CN"/>
+              </w:rPr>
             </w:pPr>
             <w:r>
               <w:rPr>
+                <w:rFonts w:hint="eastAsia"/>
                 <w:sz w:val="17"/>
-              </w:rPr>
-              <w:lastRenderedPageBreak/>
-              <w:t>小屏幕最明显，中屏和大屏也适</w:t>
-            </w:r>
-            <w:r>
-              <w:rPr>
-                <w:sz w:val="17"/>
-              </w:rPr>
-              <w:lastRenderedPageBreak/>
-              <w:t>合作为默认功能</w:t>
+                <w:lang w:eastAsia="zh-CN"/>
+              </w:rPr>
+              <w:t>在视窗资源紧张的小屏幕上有明显的提升，适合使用者观察整体的树结构。</w:t>
             </w:r>
           </w:p>
         </w:tc>
@@ -18342,7 +18532,6 @@
               <w:rPr>
                 <w:sz w:val="17"/>
               </w:rPr>
-              <w:lastRenderedPageBreak/>
               <w:t>可读连线覆盖</w:t>
             </w:r>
           </w:p>
@@ -18355,10 +18544,14 @@
           <w:p>
             <w:pPr>
               <w:spacing w:line="252" w:lineRule="auto"/>
+              <w:rPr>
+                <w:lang w:eastAsia="zh-CN"/>
+              </w:rPr>
             </w:pPr>
             <w:r>
               <w:rPr>
                 <w:sz w:val="17"/>
+                <w:lang w:eastAsia="zh-CN"/>
               </w:rPr>
               <w:t>查看穿过卡片背景的父子连线，减少线被卡片完全挡住的情况</w:t>
             </w:r>
@@ -18372,12 +18565,24 @@
           <w:p>
             <w:pPr>
               <w:spacing w:line="252" w:lineRule="auto"/>
+              <w:rPr>
+                <w:rFonts w:hint="eastAsia"/>
+                <w:lang w:eastAsia="zh-CN"/>
+              </w:rPr>
             </w:pPr>
             <w:r>
               <w:rPr>
-                <w:sz w:val="17"/>
-              </w:rPr>
-              <w:t>对局部线路判断有帮助，但不是全局整理功能</w:t>
+                <w:rFonts w:hint="eastAsia"/>
+                <w:lang w:eastAsia="zh-CN"/>
+              </w:rPr>
+              <w:t>能够帮助在复杂行为树中</w:t>
+            </w:r>
+            <w:r>
+              <w:rPr>
+                <w:rFonts w:hint="eastAsia"/>
+                <w:lang w:eastAsia="zh-CN"/>
+              </w:rPr>
+              <w:t>更好的展示逻辑关系。</w:t>
             </w:r>
           </w:p>
         </w:tc>
@@ -18389,12 +18594,18 @@
           <w:p>
             <w:pPr>
               <w:spacing w:line="252" w:lineRule="auto"/>
+              <w:rPr>
+                <w:rFonts w:hint="eastAsia"/>
+                <w:lang w:eastAsia="zh-CN"/>
+              </w:rPr>
             </w:pPr>
             <w:r>
               <w:rPr>
+                <w:rFonts w:hint="eastAsia"/>
                 <w:sz w:val="17"/>
-              </w:rPr>
-              <w:t>如果当前线路没有穿过卡片，效果就不明显</w:t>
+                <w:lang w:eastAsia="zh-CN"/>
+              </w:rPr>
+              <w:t>虽然展示了被遮挡的连线，但是这种被遮挡的连线本身就不适合逻辑铺设和理解，总体来说不如采用更合理的节点布局有用。</w:t>
             </w:r>
           </w:p>
         </w:tc>
@@ -18406,10 +18617,14 @@
           <w:p>
             <w:pPr>
               <w:spacing w:line="252" w:lineRule="auto"/>
+              <w:rPr>
+                <w:lang w:eastAsia="zh-CN"/>
+              </w:rPr>
             </w:pPr>
             <w:r>
               <w:rPr>
                 <w:sz w:val="17"/>
+                <w:lang w:eastAsia="zh-CN"/>
               </w:rPr>
               <w:t>连线密集或局部遮挡明显的树更适合</w:t>
             </w:r>
@@ -18423,12 +18638,24 @@
           <w:p>
             <w:pPr>
               <w:spacing w:line="252" w:lineRule="auto"/>
+              <w:rPr>
+                <w:lang w:eastAsia="zh-CN"/>
+              </w:rPr>
             </w:pPr>
             <w:r>
               <w:rPr>
                 <w:sz w:val="17"/>
-              </w:rPr>
-              <w:t>中屏和大屏更容易看到多条线路，小屏主要用于局部查看</w:t>
+                <w:lang w:eastAsia="zh-CN"/>
+              </w:rPr>
+              <w:t>中屏和大屏更容易看到多条线路，</w:t>
+            </w:r>
+            <w:r>
+              <w:rPr>
+                <w:rFonts w:hint="eastAsia"/>
+                <w:sz w:val="17"/>
+                <w:lang w:eastAsia="zh-CN"/>
+              </w:rPr>
+              <w:t>这使得这个功能在中大屏幕中更有效</w:t>
             </w:r>
           </w:p>
         </w:tc>
@@ -18463,12 +18690,31 @@
           <w:p>
             <w:pPr>
               <w:spacing w:line="252" w:lineRule="auto"/>
+              <w:rPr>
+                <w:lang w:eastAsia="zh-CN"/>
+              </w:rPr>
             </w:pPr>
             <w:r>
               <w:rPr>
                 <w:sz w:val="17"/>
-              </w:rPr>
-              <w:t>选择节点后检查它的父节点、子节点和同级节点</w:t>
+                <w:lang w:eastAsia="zh-CN"/>
+              </w:rPr>
+              <w:t>选择节点后</w:t>
+            </w:r>
+            <w:r>
+              <w:rPr>
+                <w:rFonts w:hint="eastAsia"/>
+                <w:sz w:val="17"/>
+                <w:lang w:eastAsia="zh-CN"/>
+              </w:rPr>
+              <w:t>高亮</w:t>
+            </w:r>
+            <w:r>
+              <w:rPr>
+                <w:sz w:val="17"/>
+                <w:lang w:eastAsia="zh-CN"/>
+              </w:rPr>
+              <w:t>它的父节点、子节点和同级节点</w:t>
             </w:r>
           </w:p>
         </w:tc>
@@ -18480,12 +18726,24 @@
           <w:p>
             <w:pPr>
               <w:spacing w:line="252" w:lineRule="auto"/>
+              <w:rPr>
+                <w:lang w:eastAsia="zh-CN"/>
+              </w:rPr>
             </w:pPr>
             <w:r>
               <w:rPr>
                 <w:sz w:val="17"/>
+                <w:lang w:eastAsia="zh-CN"/>
               </w:rPr>
               <w:t>结构检查时很直观，可以把无关分支压到背景里</w:t>
+            </w:r>
+            <w:r>
+              <w:rPr>
+                <w:rFonts w:hint="eastAsia"/>
+                <w:sz w:val="17"/>
+                <w:lang w:eastAsia="zh-CN"/>
+              </w:rPr>
+              <w:t>，适合对某个具体的分支进行调整</w:t>
             </w:r>
           </w:p>
         </w:tc>
@@ -18497,12 +18755,32 @@
           <w:p>
             <w:pPr>
               <w:spacing w:line="252" w:lineRule="auto"/>
+              <w:rPr>
+                <w:rFonts w:hint="eastAsia"/>
+                <w:lang w:eastAsia="zh-CN"/>
+              </w:rPr>
             </w:pPr>
             <w:r>
               <w:rPr>
+                <w:rFonts w:hint="eastAsia"/>
                 <w:sz w:val="17"/>
-              </w:rPr>
-              <w:t>不适合同时比较多个无关分支</w:t>
+                <w:lang w:eastAsia="zh-CN"/>
+              </w:rPr>
+              <w:t>对于有关分支的定义比较狭窄，只高亮被选择节点关联的所有父节点和子节点以及自己的同级节点。</w:t>
+            </w:r>
+            <w:r>
+              <w:rPr>
+                <w:sz w:val="17"/>
+                <w:lang w:eastAsia="zh-CN"/>
+              </w:rPr>
+              <w:br/>
+            </w:r>
+            <w:r>
+              <w:rPr>
+                <w:rFonts w:hint="eastAsia"/>
+                <w:lang w:eastAsia="zh-CN"/>
+              </w:rPr>
+              <w:t>在复杂行为树下如果需要同时考虑多个分支则可能无法展现较好的效果。</w:t>
             </w:r>
           </w:p>
         </w:tc>
@@ -18514,24 +18792,17 @@
           <w:p>
             <w:pPr>
               <w:spacing w:line="252" w:lineRule="auto"/>
+              <w:rPr>
+                <w:rFonts w:hint="eastAsia"/>
+                <w:lang w:eastAsia="zh-CN"/>
+              </w:rPr>
             </w:pPr>
             <w:r>
               <w:rPr>
-                <w:sz w:val="17"/>
-              </w:rPr>
-              <w:t>分支越多越有价值，</w:t>
-            </w:r>
-            <w:r>
-              <w:rPr>
-                <w:sz w:val="17"/>
-              </w:rPr>
-              <w:t>61</w:t>
-            </w:r>
-            <w:r>
-              <w:rPr>
-                <w:sz w:val="17"/>
-              </w:rPr>
-              <w:t>节点以上开始明显</w:t>
+                <w:rFonts w:hint="eastAsia"/>
+                <w:lang w:eastAsia="zh-CN"/>
+              </w:rPr>
+              <w:t>对于规模较大但各个分支之间关联不大的行为树最为有用，总体来说适合大型行为树。</w:t>
             </w:r>
           </w:p>
         </w:tc>
@@ -18543,12 +18814,18 @@
           <w:p>
             <w:pPr>
               <w:spacing w:line="252" w:lineRule="auto"/>
+              <w:rPr>
+                <w:rFonts w:hint="eastAsia"/>
+                <w:lang w:eastAsia="zh-CN"/>
+              </w:rPr>
             </w:pPr>
             <w:r>
               <w:rPr>
+                <w:rFonts w:hint="eastAsia"/>
                 <w:sz w:val="17"/>
-              </w:rPr>
-              <w:t>中屏和大屏优势更明显，小屏也能减少视觉干扰</w:t>
+                <w:lang w:eastAsia="zh-CN"/>
+              </w:rPr>
+              <w:t>因为这项聚焦功能主要是对被选择的节点所在的分支高亮，在树高较高的情况下，大屏幕更能展示整个分支，更符合这个功能所希望的快速处理某个分支的设计目的。</w:t>
             </w:r>
           </w:p>
         </w:tc>
@@ -18583,12 +18860,24 @@
           <w:p>
             <w:pPr>
               <w:spacing w:line="252" w:lineRule="auto"/>
+              <w:rPr>
+                <w:lang w:eastAsia="zh-CN"/>
+              </w:rPr>
             </w:pPr>
             <w:r>
               <w:rPr>
                 <w:sz w:val="17"/>
-              </w:rPr>
-              <w:t>在缩小概览中临时放大鼠标附近的目标节点</w:t>
+                <w:lang w:eastAsia="zh-CN"/>
+              </w:rPr>
+              <w:t>在缩小概览中临时放</w:t>
+            </w:r>
+            <w:r>
+              <w:rPr>
+                <w:sz w:val="17"/>
+                <w:lang w:eastAsia="zh-CN"/>
+              </w:rPr>
+              <w:lastRenderedPageBreak/>
+              <w:t>大鼠标附近的目标节点</w:t>
             </w:r>
           </w:p>
         </w:tc>
@@ -18600,12 +18889,34 @@
           <w:p>
             <w:pPr>
               <w:spacing w:line="252" w:lineRule="auto"/>
+              <w:rPr>
+                <w:rFonts w:hint="eastAsia"/>
+                <w:lang w:eastAsia="zh-CN"/>
+              </w:rPr>
             </w:pPr>
             <w:r>
               <w:rPr>
                 <w:sz w:val="17"/>
-              </w:rPr>
-              <w:t>能帮助看清局部节点，但更适合作为临时查看工具</w:t>
+                <w:lang w:eastAsia="zh-CN"/>
+              </w:rPr>
+              <w:lastRenderedPageBreak/>
+              <w:t>能帮助看清局部节</w:t>
+            </w:r>
+            <w:r>
+              <w:rPr>
+                <w:sz w:val="17"/>
+                <w:lang w:eastAsia="zh-CN"/>
+              </w:rPr>
+              <w:lastRenderedPageBreak/>
+              <w:t>点，但更适合作为临时查看工具</w:t>
+            </w:r>
+            <w:r>
+              <w:rPr>
+                <w:rFonts w:hint="eastAsia"/>
+                <w:sz w:val="17"/>
+                <w:lang w:eastAsia="zh-CN"/>
+              </w:rPr>
+              <w:t>，其主要解决了之前自适应缩放细节所导致的信息缺失的问题。</w:t>
             </w:r>
           </w:p>
         </w:tc>
@@ -18617,12 +18928,43 @@
           <w:p>
             <w:pPr>
               <w:spacing w:line="252" w:lineRule="auto"/>
+              <w:rPr>
+                <w:rFonts w:hint="eastAsia"/>
+                <w:lang w:eastAsia="zh-CN"/>
+              </w:rPr>
             </w:pPr>
             <w:r>
               <w:rPr>
                 <w:sz w:val="17"/>
-              </w:rPr>
-              <w:t>会带来局部重叠，长时间开启会影响整体结构判断</w:t>
+                <w:lang w:eastAsia="zh-CN"/>
+              </w:rPr>
+              <w:lastRenderedPageBreak/>
+              <w:t>会带来局部重叠，</w:t>
+            </w:r>
+            <w:r>
+              <w:rPr>
+                <w:rFonts w:hint="eastAsia"/>
+                <w:sz w:val="17"/>
+                <w:lang w:eastAsia="zh-CN"/>
+              </w:rPr>
+              <w:t>因</w:t>
+            </w:r>
+            <w:r>
+              <w:rPr>
+                <w:rFonts w:hint="eastAsia"/>
+                <w:sz w:val="17"/>
+                <w:lang w:eastAsia="zh-CN"/>
+              </w:rPr>
+              <w:lastRenderedPageBreak/>
+              <w:t>为鱼眼的放大效果而自动排布避免重叠会导致周边出现频繁剧烈的重新布局，虽然这些布局是临时的会在功能关闭后恢复，但这导致了该功能只能用于局部信息的临时查看，</w:t>
+            </w:r>
+            <w:r>
+              <w:rPr>
+                <w:rFonts w:hint="eastAsia"/>
+                <w:sz w:val="17"/>
+                <w:lang w:eastAsia="zh-CN"/>
+              </w:rPr>
+              <w:t>在进行整体理解时需要关闭该功能。</w:t>
             </w:r>
           </w:p>
         </w:tc>
@@ -18634,12 +18976,26 @@
           <w:p>
             <w:pPr>
               <w:spacing w:line="252" w:lineRule="auto"/>
+              <w:rPr>
+                <w:rFonts w:hint="eastAsia"/>
+                <w:lang w:eastAsia="zh-CN"/>
+              </w:rPr>
             </w:pPr>
             <w:r>
               <w:rPr>
-                <w:sz w:val="17"/>
-              </w:rPr>
-              <w:t>大型和超大型树的概览状态更适合</w:t>
+                <w:rFonts w:hint="eastAsia"/>
+                <w:lang w:eastAsia="zh-CN"/>
+              </w:rPr>
+              <w:lastRenderedPageBreak/>
+              <w:t>更适合</w:t>
+            </w:r>
+            <w:r>
+              <w:rPr>
+                <w:rFonts w:hint="eastAsia"/>
+                <w:lang w:eastAsia="zh-CN"/>
+              </w:rPr>
+              <w:lastRenderedPageBreak/>
+              <w:t>大型树用来观察某些局部内容，小型树因为规模问题一般不需要该功能。</w:t>
             </w:r>
           </w:p>
         </w:tc>
@@ -18651,21 +19007,128 @@
           <w:p>
             <w:pPr>
               <w:spacing w:line="252" w:lineRule="auto"/>
+              <w:rPr>
+                <w:rFonts w:hint="eastAsia"/>
+                <w:lang w:eastAsia="zh-CN"/>
+              </w:rPr>
             </w:pPr>
             <w:r>
               <w:rPr>
+                <w:rFonts w:hint="eastAsia"/>
                 <w:sz w:val="17"/>
-              </w:rPr>
-              <w:t>小屏幕收益最大，大屏幕中更适合按需开启</w:t>
+                <w:lang w:eastAsia="zh-CN"/>
+              </w:rPr>
+              <w:lastRenderedPageBreak/>
+              <w:t>小屏幕更加需要该功</w:t>
+            </w:r>
+            <w:r>
+              <w:rPr>
+                <w:rFonts w:hint="eastAsia"/>
+                <w:sz w:val="17"/>
+                <w:lang w:eastAsia="zh-CN"/>
+              </w:rPr>
+              <w:lastRenderedPageBreak/>
+              <w:t>能，他可以极大的弥补因为视窗尺寸不足导致的编辑和理解上的问题。</w:t>
             </w:r>
           </w:p>
         </w:tc>
       </w:tr>
     </w:tbl>
     <w:p>
-      <w:r>
-        <w:t>总体来看，自适应缩放细节最适合作为一直开启的基础显示优化；智能拖拽重排和相关节点聚焦分别更适合编辑节点位置和检查结构关系；鱼眼聚焦和可读连线覆盖更适合在特定局部问题出现时使用。</w:t>
-      </w:r>
+      <w:pPr>
+        <w:rPr>
+          <w:rFonts w:hint="eastAsia"/>
+          <w:lang w:eastAsia="zh-CN"/>
+        </w:rPr>
+      </w:pPr>
+      <w:r>
+        <w:rPr>
+          <w:rFonts w:hint="eastAsia"/>
+          <w:lang w:eastAsia="zh-CN"/>
+        </w:rPr>
+        <w:t>虽然这五个功能都有不同的适应空间，但是总体来看</w:t>
+      </w:r>
+      <w:r>
+        <w:rPr>
+          <w:sz w:val="17"/>
+          <w:lang w:eastAsia="zh-CN"/>
+        </w:rPr>
+        <w:t>智能拖拽重排</w:t>
+      </w:r>
+      <w:r>
+        <w:rPr>
+          <w:rFonts w:hint="eastAsia"/>
+          <w:sz w:val="17"/>
+          <w:lang w:eastAsia="zh-CN"/>
+        </w:rPr>
+        <w:t>，</w:t>
+      </w:r>
+      <w:r>
+        <w:rPr>
+          <w:sz w:val="17"/>
+          <w:lang w:eastAsia="zh-CN"/>
+        </w:rPr>
+        <w:t>自适应缩放细节</w:t>
+      </w:r>
+      <w:r>
+        <w:rPr>
+          <w:rFonts w:hint="eastAsia"/>
+          <w:sz w:val="17"/>
+          <w:lang w:eastAsia="zh-CN"/>
+        </w:rPr>
+        <w:t>，</w:t>
+      </w:r>
+      <w:r>
+        <w:rPr>
+          <w:sz w:val="17"/>
+          <w:lang w:eastAsia="zh-CN"/>
+        </w:rPr>
+        <w:t>可读连线覆盖</w:t>
+      </w:r>
+      <w:r>
+        <w:rPr>
+          <w:rFonts w:hint="eastAsia"/>
+          <w:sz w:val="17"/>
+          <w:lang w:eastAsia="zh-CN"/>
+        </w:rPr>
+        <w:t>和</w:t>
+      </w:r>
+      <w:r>
+        <w:rPr>
+          <w:sz w:val="17"/>
+          <w:lang w:eastAsia="zh-CN"/>
+        </w:rPr>
+        <w:t>相关节点聚焦</w:t>
+      </w:r>
+      <w:r>
+        <w:rPr>
+          <w:rFonts w:hint="eastAsia"/>
+          <w:sz w:val="17"/>
+          <w:lang w:eastAsia="zh-CN"/>
+        </w:rPr>
+        <w:t>都是适合长期开启一起使用的，他们一般不会产生非常严重的问题，同时可以改善使用者的使用情况。</w:t>
+      </w:r>
+      <w:r>
+        <w:rPr>
+          <w:sz w:val="17"/>
+        </w:rPr>
+        <w:t>鱼眼聚焦</w:t>
+      </w:r>
+      <w:r>
+        <w:rPr>
+          <w:rFonts w:hint="eastAsia"/>
+          <w:sz w:val="17"/>
+          <w:lang w:eastAsia="zh-CN"/>
+        </w:rPr>
+        <w:t>功能则只适合临时查看部分区域，在编辑行为树时最好关闭。</w:t>
+      </w:r>
+    </w:p>
+    <w:p>
+      <w:pPr>
+        <w:rPr>
+          <w:lang w:eastAsia="zh-CN"/>
+        </w:rPr>
+      </w:pPr>
     </w:p>
     <w:p>
       <w:pPr>
@@ -18872,6 +19335,7 @@
         <w:rPr>
           <w:lang w:eastAsia="zh-CN"/>
         </w:rPr>
+        <w:lastRenderedPageBreak/>
         <w:t>树变大后，卡片密度和无关分支逐渐成为主要问题。</w:t>
       </w:r>
       <w:r>
@@ -18896,40 +19360,441 @@
         <w:rPr>
           <w:lang w:eastAsia="zh-CN"/>
         </w:rPr>
-        <w:t>再让选中的结构从其他分支中突出。两者分</w:t>
-      </w:r>
+        <w:t>再让选中的结构从其他分支中突出。两者分别处理画布太满和相关结构不够明显</w:t>
+      </w:r>
+      <w:r>
+        <w:rPr>
+          <w:rFonts w:hint="eastAsia"/>
+          <w:lang w:eastAsia="zh-CN"/>
+        </w:rPr>
+        <w:t>的问题</w:t>
+      </w:r>
+      <w:r>
+        <w:rPr>
+          <w:lang w:eastAsia="zh-CN"/>
+        </w:rPr>
+        <w:t>。</w:t>
+      </w:r>
+      <w:r>
+        <w:rPr>
+          <w:rFonts w:hint="eastAsia"/>
+          <w:lang w:eastAsia="zh-CN"/>
+        </w:rPr>
+        <w:t>这让</w:t>
+      </w:r>
+      <w:r>
+        <w:rPr>
+          <w:lang w:eastAsia="zh-CN"/>
+        </w:rPr>
+        <w:t>它们在中型和大型树中更有价值的原因。</w:t>
+      </w:r>
+    </w:p>
+    <w:p>
+      <w:pPr>
+        <w:jc w:val="both"/>
+        <w:rPr>
+          <w:lang w:eastAsia="zh-CN"/>
+        </w:rPr>
+      </w:pPr>
+      <w:r>
+        <w:rPr>
+          <w:lang w:eastAsia="zh-CN"/>
+        </w:rPr>
+        <w:t>鱼眼在最大两棵树中的局部变化最明显。关闭鱼眼时，目标已经被概览缩得很小</w:t>
+      </w:r>
+      <w:r>
+        <w:rPr>
+          <w:rFonts w:hint="eastAsia"/>
+          <w:lang w:eastAsia="zh-CN"/>
+        </w:rPr>
+        <w:t>。</w:t>
+      </w:r>
+      <w:r>
+        <w:rPr>
+          <w:lang w:eastAsia="zh-CN"/>
+        </w:rPr>
+        <w:t>开启后，它会恢复到相近的可读宽度。不过，树越密集，放大的卡片越容易挡住附近内容。</w:t>
+      </w:r>
+      <w:r>
+        <w:rPr>
+          <w:rFonts w:hint="eastAsia"/>
+          <w:lang w:eastAsia="zh-CN"/>
+        </w:rPr>
+        <w:t>所以</w:t>
+      </w:r>
+      <w:r>
+        <w:rPr>
+          <w:lang w:eastAsia="zh-CN"/>
+        </w:rPr>
+        <w:t>鱼眼适合解决</w:t>
+      </w:r>
+      <w:r>
+        <w:rPr>
+          <w:rFonts w:hint="eastAsia"/>
+          <w:lang w:eastAsia="zh-CN"/>
+        </w:rPr>
+        <w:t>临时看清某个局部的问题。</w:t>
+      </w:r>
+    </w:p>
+    <w:p>
+      <w:pPr>
+        <w:jc w:val="both"/>
+        <w:rPr>
+          <w:lang w:eastAsia="zh-CN"/>
+        </w:rPr>
+      </w:pPr>
+      <w:r>
+        <w:rPr>
+          <w:lang w:eastAsia="zh-CN"/>
+        </w:rPr>
+        <w:t xml:space="preserve">Smart </w:t>
+      </w:r>
+      <w:r>
+        <w:rPr>
+          <w:lang w:eastAsia="zh-CN"/>
+        </w:rPr>
+        <w:t>和</w:t>
+      </w:r>
+      <w:r>
+        <w:rPr>
+          <w:lang w:eastAsia="zh-CN"/>
+        </w:rPr>
+        <w:t xml:space="preserve"> Overlay </w:t>
+      </w:r>
+      <w:r>
+        <w:rPr>
+          <w:lang w:eastAsia="zh-CN"/>
+        </w:rPr>
+        <w:t>的作用更多取决于局部事件，而不是节点总数。</w:t>
+      </w:r>
+      <w:r>
+        <w:rPr>
+          <w:lang w:eastAsia="zh-CN"/>
+        </w:rPr>
+        <w:t xml:space="preserve">Smart </w:t>
+      </w:r>
+      <w:r>
+        <w:rPr>
+          <w:lang w:eastAsia="zh-CN"/>
+        </w:rPr>
+        <w:t>处理当前拖动造成的碰撞，</w:t>
+      </w:r>
+      <w:r>
+        <w:rPr>
+          <w:lang w:eastAsia="zh-CN"/>
+        </w:rPr>
+        <w:t xml:space="preserve">Overlay </w:t>
+      </w:r>
+      <w:r>
+        <w:rPr>
+          <w:lang w:eastAsia="zh-CN"/>
+        </w:rPr>
+        <w:t>只有在线路穿过卡片时才有明显作用。所以，即使一棵树很大，也不能假设每次拖动或每条连线都会得到相同帮助</w:t>
+      </w:r>
+      <w:r>
+        <w:rPr>
+          <w:rFonts w:hint="eastAsia"/>
+          <w:lang w:eastAsia="zh-CN"/>
+        </w:rPr>
+        <w:t>，重点在于节点的密集程度和遮挡关系。</w:t>
+      </w:r>
+    </w:p>
+    <w:p>
+      <w:pPr>
+        <w:pStyle w:val="31"/>
+        <w:rPr>
+          <w:lang w:eastAsia="zh-CN"/>
+        </w:rPr>
+      </w:pPr>
+      <w:bookmarkStart w:id="68" w:name="_Toc238830674"/>
+      <w:r>
+        <w:rPr>
+          <w:lang w:eastAsia="zh-CN"/>
+        </w:rPr>
+        <w:t>6.2.2</w:t>
+      </w:r>
+      <w:r>
+        <w:rPr>
+          <w:lang w:eastAsia="zh-CN"/>
+        </w:rPr>
+        <w:t xml:space="preserve">　不同物理屏幕尺寸下的优化效果</w:t>
+      </w:r>
+      <w:bookmarkEnd w:id="68"/>
+    </w:p>
+    <w:p>
+      <w:pPr>
+        <w:jc w:val="both"/>
+        <w:rPr>
+          <w:lang w:eastAsia="zh-CN"/>
+        </w:rPr>
+      </w:pPr>
+      <w:r>
+        <w:rPr>
+          <w:lang w:eastAsia="zh-CN"/>
+        </w:rPr>
+        <w:t>屏幕结果说明，小屏和大屏需要的帮助不同。小屏概览中的卡片更容易被压得很小，因此</w:t>
+      </w:r>
+      <w:r>
+        <w:rPr>
+          <w:lang w:eastAsia="zh-CN"/>
+        </w:rPr>
+        <w:t xml:space="preserve"> Adaptive </w:t>
+      </w:r>
+      <w:r>
+        <w:rPr>
+          <w:lang w:eastAsia="zh-CN"/>
+        </w:rPr>
+        <w:t>和鱼眼的相对作用最明显。</w:t>
+      </w:r>
+      <w:r>
+        <w:rPr>
+          <w:lang w:eastAsia="zh-CN"/>
+        </w:rPr>
+        <w:t xml:space="preserve">Adaptive </w:t>
+      </w:r>
+      <w:r>
+        <w:rPr>
+          <w:lang w:eastAsia="zh-CN"/>
+        </w:rPr>
+        <w:t>先减少全局占用，鱼眼再恢复当前局部。它们不能把小屏变成大屏，但可以让小屏在查看大型树时少受空间限制。</w:t>
+      </w:r>
+    </w:p>
+    <w:p>
+      <w:pPr>
+        <w:jc w:val="both"/>
+        <w:rPr>
+          <w:lang w:eastAsia="zh-CN"/>
+        </w:rPr>
+      </w:pPr>
+      <w:r>
+        <w:rPr>
+          <w:lang w:eastAsia="zh-CN"/>
+        </w:rPr>
+        <w:t>大屏本来就能同时显示更多内容，所以进一步缩小卡片或放大单个目标的相对变化没有小屏那么大。</w:t>
+      </w:r>
+      <w:r>
+        <w:rPr>
+          <w:lang w:eastAsia="zh-CN"/>
+        </w:rPr>
+        <w:t xml:space="preserve">Related Focus </w:t>
+      </w:r>
+      <w:r>
+        <w:rPr>
+          <w:lang w:eastAsia="zh-CN"/>
+        </w:rPr>
+        <w:t>在这里更有优势，因为它不会丢掉大屏已经显示出的全局位置，只会让无关分支变淡。对大屏来说，这比继续压缩所有节点更符合结构检查任务。</w:t>
+      </w:r>
+    </w:p>
+    <w:p>
+      <w:pPr>
+        <w:jc w:val="both"/>
+        <w:rPr>
+          <w:lang w:eastAsia="zh-CN"/>
+        </w:rPr>
+      </w:pPr>
+      <w:r>
+        <w:rPr>
+          <w:lang w:eastAsia="zh-CN"/>
+        </w:rPr>
+        <w:t>鱼眼也表现出很直接的权衡</w:t>
+      </w:r>
+      <w:r>
+        <w:rPr>
+          <w:rFonts w:hint="eastAsia"/>
+          <w:lang w:eastAsia="zh-CN"/>
+        </w:rPr>
+        <w:t>，</w:t>
+      </w:r>
+      <w:r>
+        <w:rPr>
+          <w:lang w:eastAsia="zh-CN"/>
+        </w:rPr>
+        <w:t>小屏上的局部恢复最明显，新增遮挡也最多。屏幕变大后，焦点原本就更清楚，鱼眼造成的画面变化会更温和。比较合理的用法是在小屏概览中短暂查看目标，完成后退出鱼眼，而不是把它一直当作主布局。</w:t>
+      </w:r>
+    </w:p>
+    <w:p>
+      <w:pPr>
+        <w:jc w:val="both"/>
+        <w:rPr>
+          <w:lang w:eastAsia="zh-CN"/>
+        </w:rPr>
+      </w:pPr>
+      <w:r>
+        <w:rPr>
+          <w:lang w:eastAsia="zh-CN"/>
+        </w:rPr>
+        <w:t xml:space="preserve">Smart </w:t>
+      </w:r>
+      <w:r>
+        <w:rPr>
+          <w:lang w:eastAsia="zh-CN"/>
+        </w:rPr>
+        <w:t>和</w:t>
+      </w:r>
+      <w:r>
+        <w:rPr>
+          <w:lang w:eastAsia="zh-CN"/>
+        </w:rPr>
+        <w:t xml:space="preserve"> Overlay </w:t>
+      </w:r>
+      <w:r>
+        <w:rPr>
+          <w:lang w:eastAsia="zh-CN"/>
+        </w:rPr>
+        <w:t>在当前实验中没有表现出明显的屏幕差异，因为它们使用的是相同局部操作。</w:t>
+      </w:r>
+    </w:p>
+    <w:p>
+      <w:pPr>
+        <w:pStyle w:val="31"/>
+        <w:rPr>
+          <w:lang w:eastAsia="zh-CN"/>
+        </w:rPr>
+      </w:pPr>
+      <w:bookmarkStart w:id="69" w:name="_Toc238830675"/>
       <w:r>
         <w:rPr>
           <w:lang w:eastAsia="zh-CN"/>
         </w:rPr>
         <w:lastRenderedPageBreak/>
-        <w:t>别处理画布太满和相关结构不够明显</w:t>
+        <w:t>6.2.3</w:t>
+      </w:r>
+      <w:r>
+        <w:rPr>
+          <w:lang w:eastAsia="zh-CN"/>
+        </w:rPr>
+        <w:t xml:space="preserve">　</w:t>
+      </w:r>
+      <w:bookmarkEnd w:id="69"/>
+      <w:r>
+        <w:rPr>
+          <w:rFonts w:ascii="宋体" w:eastAsia="宋体" w:hAnsi="宋体" w:hint="eastAsia"/>
+          <w:lang w:eastAsia="zh-CN"/>
+        </w:rPr>
+        <w:t>各个功能的价值</w:t>
+      </w:r>
+    </w:p>
+    <w:p>
+      <w:pPr>
+        <w:jc w:val="both"/>
+        <w:rPr>
+          <w:lang w:eastAsia="zh-CN"/>
+        </w:rPr>
+      </w:pPr>
+      <w:r>
+        <w:rPr>
+          <w:lang w:eastAsia="zh-CN"/>
+        </w:rPr>
+        <w:t>从本项目的实际使用来看，如果只能选择一项一直开启的功能，</w:t>
+      </w:r>
+      <w:r>
+        <w:rPr>
+          <w:lang w:eastAsia="zh-CN"/>
+        </w:rPr>
+        <w:t xml:space="preserve">Adaptive </w:t>
+      </w:r>
+      <w:r>
+        <w:rPr>
+          <w:lang w:eastAsia="zh-CN"/>
+        </w:rPr>
+        <w:t>最合适。它在浏览整棵树时持续工作，关闭后也能恢复完整卡片。它的代价很清楚：缩小时看不到全部字段，但用户可以通过放大或鱼眼恢复局部细节。</w:t>
+      </w:r>
+    </w:p>
+    <w:p>
+      <w:pPr>
+        <w:jc w:val="both"/>
+        <w:rPr>
+          <w:lang w:eastAsia="zh-CN"/>
+        </w:rPr>
+      </w:pPr>
+      <w:r>
+        <w:rPr>
+          <w:lang w:eastAsia="zh-CN"/>
+        </w:rPr>
+        <w:t>具体任务的答案并不相同</w:t>
       </w:r>
       <w:r>
         <w:rPr>
           <w:rFonts w:hint="eastAsia"/>
           <w:lang w:eastAsia="zh-CN"/>
         </w:rPr>
-        <w:t>的问题</w:t>
-      </w:r>
-      <w:r>
-        <w:rPr>
+        <w:t>，</w:t>
+      </w:r>
+      <w:r>
+        <w:rPr>
+          <w:lang w:eastAsia="zh-CN"/>
+        </w:rPr>
+        <w:t xml:space="preserve">Smart </w:t>
+      </w:r>
+      <w:r>
+        <w:rPr>
+          <w:lang w:eastAsia="zh-CN"/>
+        </w:rPr>
+        <w:t>在拖动编辑时最直接，因为它处理的是刚刚产生的遮挡。</w:t>
+      </w:r>
+      <w:r>
+        <w:rPr>
+          <w:lang w:eastAsia="zh-CN"/>
+        </w:rPr>
+        <w:t xml:space="preserve">Related </w:t>
+      </w:r>
+      <w:r>
+        <w:rPr>
+          <w:lang w:eastAsia="zh-CN"/>
+        </w:rPr>
+        <w:t>在结构检查时最有价值，因为它不会移动节点，只会把所有选中节点的相关结构保留下来。</w:t>
+      </w:r>
+    </w:p>
+    <w:p>
+      <w:pPr>
+        <w:jc w:val="both"/>
+        <w:rPr>
+          <w:lang w:eastAsia="zh-CN"/>
+        </w:rPr>
+      </w:pPr>
+      <w:r>
+        <w:rPr>
+          <w:lang w:eastAsia="zh-CN"/>
+        </w:rPr>
+        <w:t>鱼眼在特定环境中的相对变化最大</w:t>
+      </w:r>
+      <w:r>
+        <w:rPr>
+          <w:rFonts w:hint="eastAsia"/>
           <w:lang w:eastAsia="zh-CN"/>
         </w:rPr>
         <w:t>。</w:t>
       </w:r>
       <w:r>
         <w:rPr>
+          <w:lang w:eastAsia="zh-CN"/>
+        </w:rPr>
+        <w:t>它的放大效果越强，局部遮挡也越明显，因此更适合作为</w:t>
+      </w:r>
+      <w:r>
+        <w:rPr>
           <w:rFonts w:hint="eastAsia"/>
           <w:lang w:eastAsia="zh-CN"/>
         </w:rPr>
-        <w:t>这让</w:t>
-      </w:r>
-      <w:r>
-        <w:rPr>
-          <w:lang w:eastAsia="zh-CN"/>
-        </w:rPr>
-        <w:t>它们在中型和大型树中更有价值的原因。</w:t>
+        <w:t>临时的查看工具</w:t>
+      </w:r>
+      <w:r>
+        <w:rPr>
+          <w:lang w:eastAsia="zh-CN"/>
+        </w:rPr>
+        <w:t>。</w:t>
+      </w:r>
+      <w:r>
+        <w:rPr>
+          <w:lang w:eastAsia="zh-CN"/>
+        </w:rPr>
+        <w:t xml:space="preserve">Overlay </w:t>
+      </w:r>
+      <w:r>
+        <w:rPr>
+          <w:lang w:eastAsia="zh-CN"/>
+        </w:rPr>
+        <w:t>的作用最局部，它可以补充被卡片挡住的连线，但不能减少节点、字段或候选数量。</w:t>
       </w:r>
     </w:p>
     <w:p>
@@ -18943,468 +19808,325 @@
         <w:rPr>
           <w:lang w:eastAsia="zh-CN"/>
         </w:rPr>
-        <w:t>鱼眼在最大两棵树中的局部变化最明显。关闭鱼眼时，目标已经被概览缩得很小</w:t>
-      </w:r>
+        <w:t>综合来看，</w:t>
+      </w:r>
+      <w:r>
+        <w:rPr>
+          <w:lang w:eastAsia="zh-CN"/>
+        </w:rPr>
+        <w:t xml:space="preserve">Adaptive </w:t>
+      </w:r>
+      <w:r>
+        <w:rPr>
+          <w:lang w:eastAsia="zh-CN"/>
+        </w:rPr>
+        <w:t>适合作为概览基础，</w:t>
+      </w:r>
+      <w:r>
+        <w:rPr>
+          <w:lang w:eastAsia="zh-CN"/>
+        </w:rPr>
+        <w:t xml:space="preserve">Smart </w:t>
+      </w:r>
+      <w:r>
+        <w:rPr>
+          <w:lang w:eastAsia="zh-CN"/>
+        </w:rPr>
+        <w:t>和</w:t>
+      </w:r>
+      <w:r>
+        <w:rPr>
+          <w:lang w:eastAsia="zh-CN"/>
+        </w:rPr>
+        <w:t xml:space="preserve"> Related </w:t>
+      </w:r>
+      <w:r>
+        <w:rPr>
+          <w:lang w:eastAsia="zh-CN"/>
+        </w:rPr>
+        <w:t>分别服务编辑与结构检查，</w:t>
+      </w:r>
+      <w:r>
+        <w:rPr>
+          <w:lang w:eastAsia="zh-CN"/>
+        </w:rPr>
+        <w:t xml:space="preserve">Fisheye </w:t>
+      </w:r>
+      <w:r>
+        <w:rPr>
+          <w:lang w:eastAsia="zh-CN"/>
+        </w:rPr>
+        <w:t>和</w:t>
+      </w:r>
+      <w:r>
+        <w:rPr>
+          <w:lang w:eastAsia="zh-CN"/>
+        </w:rPr>
+        <w:t xml:space="preserve"> Overlay </w:t>
+      </w:r>
+      <w:r>
+        <w:rPr>
+          <w:lang w:eastAsia="zh-CN"/>
+        </w:rPr>
+        <w:t>则在局部问题出现时使用。</w:t>
+      </w:r>
+    </w:p>
+    <w:p>
+      <w:pPr>
+        <w:pStyle w:val="1"/>
+        <w:rPr>
+          <w:lang w:eastAsia="zh-CN"/>
+        </w:rPr>
+      </w:pPr>
+      <w:bookmarkStart w:id="70" w:name="_Toc238830676"/>
+      <w:r>
+        <w:rPr>
+          <w:lang w:eastAsia="zh-CN"/>
+        </w:rPr>
+        <w:t>第</w:t>
+      </w:r>
+      <w:r>
+        <w:rPr>
+          <w:lang w:eastAsia="zh-CN"/>
+        </w:rPr>
+        <w:t>7</w:t>
+      </w:r>
+      <w:r>
+        <w:rPr>
+          <w:lang w:eastAsia="zh-CN"/>
+        </w:rPr>
+        <w:t>章　结论</w:t>
+      </w:r>
+      <w:bookmarkEnd w:id="70"/>
+    </w:p>
+    <w:p>
+      <w:pPr>
+        <w:rPr>
+          <w:lang w:eastAsia="zh-CN"/>
+        </w:rPr>
+      </w:pPr>
+      <w:r>
+        <w:rPr>
+          <w:lang w:eastAsia="zh-CN"/>
+        </w:rPr>
+        <w:t>本项目完成了一个</w:t>
+      </w:r>
+      <w:r>
+        <w:rPr>
+          <w:lang w:eastAsia="zh-CN"/>
+        </w:rPr>
+        <w:t xml:space="preserve"> Godot 4.6 </w:t>
+      </w:r>
+      <w:r>
+        <w:rPr>
+          <w:lang w:eastAsia="zh-CN"/>
+        </w:rPr>
+        <w:t>可视化行为树插件，并围绕大型行为树的显示和编辑问题进行了改进。插件支持行为树资源的创建、连接、编辑、保存和重新加载，也实现了执行系统、黑板、</w:t>
+      </w:r>
+      <w:r>
+        <w:rPr>
+          <w:lang w:eastAsia="zh-CN"/>
+        </w:rPr>
+        <w:t xml:space="preserve">Decorator </w:t>
+      </w:r>
+      <w:r>
+        <w:rPr>
+          <w:lang w:eastAsia="zh-CN"/>
+        </w:rPr>
+        <w:t>和</w:t>
+      </w:r>
+      <w:r>
+        <w:rPr>
+          <w:lang w:eastAsia="zh-CN"/>
+        </w:rPr>
+        <w:t xml:space="preserve"> Live Debug </w:t>
+      </w:r>
+      <w:r>
+        <w:rPr>
+          <w:lang w:eastAsia="zh-CN"/>
+        </w:rPr>
+        <w:t>等功能。通过这些功能，行为树可以真实控制游戏中的敌人。</w:t>
+      </w:r>
+    </w:p>
+    <w:p>
+      <w:pPr>
+        <w:rPr>
+          <w:lang w:eastAsia="zh-CN"/>
+        </w:rPr>
+      </w:pPr>
+      <w:r>
+        <w:rPr>
+          <w:lang w:eastAsia="zh-CN"/>
+        </w:rPr>
+        <w:t>本文测试了五项显示优化功能：智能拖拽重排、自适应缩放细节、可读连线覆盖、相关节点聚焦和鱼眼聚焦。实验使用五棵不同规模的真实游戏行为树，并在三种屏幕尺寸条件下比较功能开启前后的变化。</w:t>
+      </w:r>
+    </w:p>
+    <w:p>
+      <w:pPr>
+        <w:rPr>
+          <w:lang w:eastAsia="zh-CN"/>
+        </w:rPr>
+      </w:pPr>
+      <w:r>
+        <w:rPr>
+          <w:lang w:eastAsia="zh-CN"/>
+        </w:rPr>
+        <w:t>实验结果说明，五项显示优化功能都能在各自目标上产生作用，并且没有改变行为树结构、保存坐标和同级执行顺序。其中，自适应缩放细节的效果最稳定，适合作为长期开启的基础功能；智能拖拽重排更适合节点编辑；相关节点聚焦更适合检查选中节点所在的结构；可读连线覆盖主要解决局部连线遮挡；鱼眼聚焦在小屏幕和大型行为树中最明显，但也更容易带来局部遮挡，因此更适合作为临时查看工具。</w:t>
+      </w:r>
+    </w:p>
+    <w:p>
+      <w:pPr>
+        <w:rPr>
+          <w:lang w:eastAsia="zh-CN"/>
+        </w:rPr>
+      </w:pPr>
       <w:r>
         <w:rPr>
           <w:rFonts w:hint="eastAsia"/>
           <w:lang w:eastAsia="zh-CN"/>
         </w:rPr>
+        <w:t>总体来看</w:t>
+      </w:r>
+      <w:r>
+        <w:rPr>
+          <w:lang w:eastAsia="zh-CN"/>
+        </w:rPr>
+        <w:t>，显示优化功能在大型行为树中更有价值。节点数量增加后，画布占用、无关分支和局部遮挡会更加影响查看和编辑。小屏幕更依赖自适应</w:t>
+      </w:r>
+      <w:r>
+        <w:rPr>
+          <w:lang w:eastAsia="zh-CN"/>
+        </w:rPr>
+        <w:lastRenderedPageBreak/>
+        <w:t>缩放和鱼眼聚焦来弥补空间不足</w:t>
+      </w:r>
+      <w:r>
+        <w:rPr>
+          <w:rFonts w:hint="eastAsia"/>
+          <w:lang w:eastAsia="zh-CN"/>
+        </w:rPr>
         <w:t>。</w:t>
       </w:r>
       <w:r>
         <w:rPr>
           <w:lang w:eastAsia="zh-CN"/>
         </w:rPr>
-        <w:t>开启后，它会恢复到相近的可读宽度。不过，树越密集，放大的卡片越容易挡住附近内容。</w:t>
+        <w:t>大屏幕则更适合使用相关节点聚焦，在保留全局结构的同时降低无关分支干扰。</w:t>
+      </w:r>
+    </w:p>
+    <w:p>
+      <w:pPr>
+        <w:rPr>
+          <w:lang w:eastAsia="zh-CN"/>
+        </w:rPr>
+      </w:pPr>
+      <w:r>
+        <w:rPr>
+          <w:lang w:eastAsia="zh-CN"/>
+        </w:rPr>
+        <w:t>本项目仍然存在一些限制。结构化开发者评价来自项目开发者本人，</w:t>
       </w:r>
       <w:r>
         <w:rPr>
           <w:rFonts w:hint="eastAsia"/>
           <w:lang w:eastAsia="zh-CN"/>
         </w:rPr>
-        <w:t>所以</w:t>
-      </w:r>
-      <w:r>
-        <w:rPr>
-          <w:lang w:eastAsia="zh-CN"/>
-        </w:rPr>
-        <w:t>鱼眼适合解决</w:t>
+        <w:t>缺乏普适性</w:t>
+      </w:r>
+      <w:r>
+        <w:rPr>
+          <w:lang w:eastAsia="zh-CN"/>
+        </w:rPr>
+        <w:t>。实验使用的是项目中的五棵真实行为树，它们能反映本项目场景下的实际表现，但不能覆盖所有类型的游戏</w:t>
+      </w:r>
+      <w:r>
+        <w:rPr>
+          <w:lang w:eastAsia="zh-CN"/>
+        </w:rPr>
+        <w:t xml:space="preserve"> AI </w:t>
+      </w:r>
+      <w:r>
+        <w:rPr>
+          <w:lang w:eastAsia="zh-CN"/>
+        </w:rPr>
+        <w:t>行为树。</w:t>
+      </w:r>
+    </w:p>
+    <w:p>
+      <w:pPr>
+        <w:rPr>
+          <w:lang w:eastAsia="zh-CN"/>
+        </w:rPr>
+      </w:pPr>
+      <w:r>
+        <w:rPr>
+          <w:lang w:eastAsia="zh-CN"/>
+        </w:rPr>
+        <w:t>未来工作可以从</w:t>
       </w:r>
       <w:r>
         <w:rPr>
           <w:rFonts w:hint="eastAsia"/>
           <w:lang w:eastAsia="zh-CN"/>
         </w:rPr>
-        <w:t>临时看清某个局部的问题。</w:t>
-      </w:r>
-    </w:p>
-    <w:p>
-      <w:pPr>
-        <w:jc w:val="both"/>
-        <w:rPr>
-          <w:lang w:eastAsia="zh-CN"/>
-        </w:rPr>
-      </w:pPr>
-      <w:r>
-        <w:rPr>
-          <w:lang w:eastAsia="zh-CN"/>
-        </w:rPr>
-        <w:t xml:space="preserve">Smart </w:t>
-      </w:r>
-      <w:r>
-        <w:rPr>
-          <w:lang w:eastAsia="zh-CN"/>
-        </w:rPr>
-        <w:t>和</w:t>
-      </w:r>
-      <w:r>
-        <w:rPr>
-          <w:lang w:eastAsia="zh-CN"/>
-        </w:rPr>
-        <w:t xml:space="preserve"> Overlay </w:t>
-      </w:r>
-      <w:r>
-        <w:rPr>
-          <w:lang w:eastAsia="zh-CN"/>
-        </w:rPr>
-        <w:t>的作用更多取决于局部事件，而不是节点总数。</w:t>
-      </w:r>
-      <w:r>
-        <w:rPr>
-          <w:lang w:eastAsia="zh-CN"/>
-        </w:rPr>
-        <w:t xml:space="preserve">Smart </w:t>
-      </w:r>
-      <w:r>
-        <w:rPr>
-          <w:lang w:eastAsia="zh-CN"/>
-        </w:rPr>
-        <w:t>处理当前拖动造成的碰撞，</w:t>
-      </w:r>
-      <w:r>
-        <w:rPr>
-          <w:lang w:eastAsia="zh-CN"/>
-        </w:rPr>
-        <w:t xml:space="preserve">Overlay </w:t>
-      </w:r>
-      <w:r>
-        <w:rPr>
-          <w:lang w:eastAsia="zh-CN"/>
-        </w:rPr>
-        <w:t>只有在线路穿过卡片时才有明显作用。所以，即使一棵树很大，也不能假设每次拖动或每条连线都会得到相同帮助</w:t>
+        <w:t>这两个</w:t>
+      </w:r>
+      <w:r>
+        <w:rPr>
+          <w:lang w:eastAsia="zh-CN"/>
+        </w:rPr>
+        <w:t>方向继续改进。可以邀请更多开发者进行真实使用测试，记录他们完成查找、编辑和调试任务时的时间、错误和主观评价。可以在更多类型的游戏行为树上测试这些显示优化功能，观察它们是否仍然适用于更复杂或结构差异更大的项目。</w:t>
+      </w:r>
+    </w:p>
+    <w:p>
+      <w:pPr>
+        <w:rPr>
+          <w:lang w:eastAsia="zh-CN"/>
+        </w:rPr>
+      </w:pPr>
+      <w:r>
+        <w:rPr>
+          <w:lang w:eastAsia="zh-CN"/>
+        </w:rPr>
+        <w:t>综上所述，本项目实现了一个能够用于真实游戏场景的</w:t>
+      </w:r>
+      <w:r>
+        <w:rPr>
+          <w:lang w:eastAsia="zh-CN"/>
+        </w:rPr>
+        <w:t xml:space="preserve"> Godot </w:t>
+      </w:r>
+      <w:r>
+        <w:rPr>
+          <w:lang w:eastAsia="zh-CN"/>
+        </w:rPr>
+        <w:t>可视化行为树插件，并通过实验说明，</w:t>
       </w:r>
       <w:r>
         <w:rPr>
           <w:rFonts w:hint="eastAsia"/>
           <w:lang w:eastAsia="zh-CN"/>
         </w:rPr>
-        <w:t>，重点在于节点的密集程度和遮挡关系。</w:t>
-      </w:r>
-    </w:p>
-    <w:p>
-      <w:pPr>
-        <w:pStyle w:val="31"/>
-        <w:rPr>
-          <w:lang w:eastAsia="zh-CN"/>
-        </w:rPr>
-      </w:pPr>
-      <w:bookmarkStart w:id="68" w:name="_Toc238830674"/>
-      <w:r>
-        <w:rPr>
-          <w:lang w:eastAsia="zh-CN"/>
-        </w:rPr>
-        <w:t>6.2.2</w:t>
-      </w:r>
-      <w:r>
-        <w:rPr>
-          <w:lang w:eastAsia="zh-CN"/>
-        </w:rPr>
-        <w:t xml:space="preserve">　不同物理屏幕尺寸下的优化效果</w:t>
-      </w:r>
-      <w:bookmarkEnd w:id="68"/>
-    </w:p>
-    <w:p>
-      <w:pPr>
-        <w:jc w:val="both"/>
-        <w:rPr>
-          <w:lang w:eastAsia="zh-CN"/>
-        </w:rPr>
-      </w:pPr>
-      <w:r>
-        <w:rPr>
-          <w:lang w:eastAsia="zh-CN"/>
-        </w:rPr>
-        <w:t>屏幕结果说明，小屏和大屏需要的帮助不同。小屏概览中的卡片更容易被压得很小，因此</w:t>
-      </w:r>
-      <w:r>
-        <w:rPr>
-          <w:lang w:eastAsia="zh-CN"/>
-        </w:rPr>
-        <w:t xml:space="preserve"> Adaptive </w:t>
-      </w:r>
-      <w:r>
-        <w:rPr>
-          <w:lang w:eastAsia="zh-CN"/>
-        </w:rPr>
-        <w:t>和鱼眼的相对作用最明显。</w:t>
-      </w:r>
-      <w:r>
-        <w:rPr>
-          <w:lang w:eastAsia="zh-CN"/>
-        </w:rPr>
-        <w:t xml:space="preserve">Adaptive </w:t>
-      </w:r>
-      <w:r>
-        <w:rPr>
-          <w:lang w:eastAsia="zh-CN"/>
-        </w:rPr>
-        <w:t>先减少全局占用，鱼眼再恢复当前局部。它们不能把小屏变成大屏，但可以让小屏在查看大型树时少受空间限制。</w:t>
-      </w:r>
-    </w:p>
-    <w:p>
-      <w:pPr>
-        <w:jc w:val="both"/>
-        <w:rPr>
-          <w:lang w:eastAsia="zh-CN"/>
-        </w:rPr>
-      </w:pPr>
-      <w:r>
-        <w:rPr>
-          <w:lang w:eastAsia="zh-CN"/>
-        </w:rPr>
-        <w:t>大屏本来就能同时显示更多内容，所以进一步缩小卡片或放大单个目标的相对变化没有小屏那么大。</w:t>
-      </w:r>
-      <w:r>
-        <w:rPr>
-          <w:lang w:eastAsia="zh-CN"/>
-        </w:rPr>
-        <w:t xml:space="preserve">Related Focus </w:t>
-      </w:r>
-      <w:r>
-        <w:rPr>
-          <w:lang w:eastAsia="zh-CN"/>
-        </w:rPr>
-        <w:t>在这里更有优势，因为它不会丢掉大屏已经显示出的全局位置，只会让无关分支变淡。对大屏来说，这比继续压缩所有节点更符合结构检查任务。</w:t>
-      </w:r>
-    </w:p>
-    <w:p>
-      <w:pPr>
-        <w:jc w:val="both"/>
-        <w:rPr>
-          <w:lang w:eastAsia="zh-CN"/>
-        </w:rPr>
-      </w:pPr>
-      <w:r>
-        <w:rPr>
-          <w:lang w:eastAsia="zh-CN"/>
-        </w:rPr>
-        <w:t>鱼眼也表现出很直接的权衡</w:t>
-      </w:r>
-      <w:r>
-        <w:rPr>
-          <w:rFonts w:hint="eastAsia"/>
-          <w:lang w:eastAsia="zh-CN"/>
-        </w:rPr>
-        <w:t>，</w:t>
-      </w:r>
-      <w:r>
-        <w:rPr>
-          <w:lang w:eastAsia="zh-CN"/>
-        </w:rPr>
-        <w:t>小屏上的局部恢复最明显，新增遮挡也最多。屏幕变大后，焦点原本就更清楚，鱼眼造成的画面变化会更温和。比较合理的用法是在小屏概览中短暂查看目标，完成后退出鱼眼，而不是把它一直当作主布局。</w:t>
-      </w:r>
-    </w:p>
-    <w:p>
-      <w:pPr>
-        <w:jc w:val="both"/>
-        <w:rPr>
-          <w:lang w:eastAsia="zh-CN"/>
-        </w:rPr>
-      </w:pPr>
-      <w:r>
-        <w:rPr>
-          <w:lang w:eastAsia="zh-CN"/>
-        </w:rPr>
-        <w:t xml:space="preserve">Smart </w:t>
-      </w:r>
-      <w:r>
-        <w:rPr>
-          <w:lang w:eastAsia="zh-CN"/>
-        </w:rPr>
-        <w:t>和</w:t>
-      </w:r>
-      <w:r>
-        <w:rPr>
-          <w:lang w:eastAsia="zh-CN"/>
-        </w:rPr>
-        <w:t xml:space="preserve"> Overlay </w:t>
-      </w:r>
-      <w:r>
-        <w:rPr>
-          <w:lang w:eastAsia="zh-CN"/>
-        </w:rPr>
-        <w:t>在当前实验中没有表现出明显的屏幕差异，因为它们使用的是相同局部操作。</w:t>
-      </w:r>
-    </w:p>
-    <w:p>
-      <w:pPr>
-        <w:pStyle w:val="31"/>
-        <w:rPr>
-          <w:lang w:eastAsia="zh-CN"/>
-        </w:rPr>
-      </w:pPr>
-      <w:bookmarkStart w:id="69" w:name="_Toc238830675"/>
-      <w:r>
-        <w:rPr>
-          <w:lang w:eastAsia="zh-CN"/>
-        </w:rPr>
-        <w:t>6.2.3</w:t>
-      </w:r>
-      <w:r>
-        <w:rPr>
-          <w:lang w:eastAsia="zh-CN"/>
-        </w:rPr>
-        <w:t xml:space="preserve">　哪些功能最有价值</w:t>
-      </w:r>
-      <w:bookmarkEnd w:id="69"/>
-    </w:p>
-    <w:p>
-      <w:pPr>
-        <w:jc w:val="both"/>
-        <w:rPr>
-          <w:lang w:eastAsia="zh-CN"/>
-        </w:rPr>
-      </w:pPr>
-      <w:r>
-        <w:rPr>
-          <w:lang w:eastAsia="zh-CN"/>
-        </w:rPr>
-        <w:t>从本项目的实际使用来看，如果只能选择一项一直开启的功能，</w:t>
-      </w:r>
-      <w:r>
-        <w:rPr>
-          <w:lang w:eastAsia="zh-CN"/>
-        </w:rPr>
-        <w:t xml:space="preserve">Adaptive </w:t>
-      </w:r>
-      <w:r>
-        <w:rPr>
-          <w:lang w:eastAsia="zh-CN"/>
-        </w:rPr>
-        <w:t>最合适。它在浏览整棵树时持续工作，关闭后也能恢复完整卡片。它的代价很清楚：缩小时看不到全部字段，但用户可以通过放大或鱼眼恢复局部细节。</w:t>
-      </w:r>
-    </w:p>
-    <w:p>
-      <w:pPr>
-        <w:jc w:val="both"/>
-        <w:rPr>
-          <w:lang w:eastAsia="zh-CN"/>
-        </w:rPr>
-      </w:pPr>
-      <w:r>
-        <w:rPr>
-          <w:lang w:eastAsia="zh-CN"/>
-        </w:rPr>
-        <w:lastRenderedPageBreak/>
-        <w:t>具体任务的答案并不相同</w:t>
-      </w:r>
-      <w:r>
-        <w:rPr>
-          <w:rFonts w:hint="eastAsia"/>
-          <w:lang w:eastAsia="zh-CN"/>
-        </w:rPr>
-        <w:t>，</w:t>
-      </w:r>
-      <w:r>
-        <w:rPr>
-          <w:lang w:eastAsia="zh-CN"/>
-        </w:rPr>
-        <w:t xml:space="preserve">Smart </w:t>
-      </w:r>
-      <w:r>
-        <w:rPr>
-          <w:lang w:eastAsia="zh-CN"/>
-        </w:rPr>
-        <w:t>在拖动编辑时最直接，因为它处理的是刚刚产生的遮挡。</w:t>
-      </w:r>
-      <w:r>
-        <w:rPr>
-          <w:lang w:eastAsia="zh-CN"/>
-        </w:rPr>
-        <w:t xml:space="preserve">Related </w:t>
-      </w:r>
-      <w:r>
-        <w:rPr>
-          <w:lang w:eastAsia="zh-CN"/>
-        </w:rPr>
-        <w:t>在结构检查时最有价值，因为它不会移动节点，只会把所有选中节点的相关结构保留下来。</w:t>
-      </w:r>
-    </w:p>
-    <w:p>
-      <w:pPr>
-        <w:jc w:val="both"/>
-        <w:rPr>
-          <w:lang w:eastAsia="zh-CN"/>
-        </w:rPr>
-      </w:pPr>
-      <w:r>
-        <w:rPr>
-          <w:lang w:eastAsia="zh-CN"/>
-        </w:rPr>
-        <w:t>鱼眼在特定环境中的相对变化最大</w:t>
-      </w:r>
-      <w:r>
-        <w:rPr>
-          <w:rFonts w:hint="eastAsia"/>
-          <w:lang w:eastAsia="zh-CN"/>
-        </w:rPr>
-        <w:t>。</w:t>
-      </w:r>
-      <w:r>
-        <w:rPr>
-          <w:lang w:eastAsia="zh-CN"/>
-        </w:rPr>
-        <w:t>它的放大效果越强，局部遮挡也越明显，因此更适合作为</w:t>
-      </w:r>
-      <w:r>
-        <w:rPr>
-          <w:rFonts w:hint="eastAsia"/>
-          <w:lang w:eastAsia="zh-CN"/>
-        </w:rPr>
-        <w:t>临时的查看工具</w:t>
-      </w:r>
-      <w:r>
-        <w:rPr>
-          <w:lang w:eastAsia="zh-CN"/>
-        </w:rPr>
-        <w:t>。</w:t>
-      </w:r>
-      <w:r>
-        <w:rPr>
-          <w:lang w:eastAsia="zh-CN"/>
-        </w:rPr>
-        <w:t xml:space="preserve">Overlay </w:t>
-      </w:r>
-      <w:r>
-        <w:rPr>
-          <w:lang w:eastAsia="zh-CN"/>
-        </w:rPr>
-        <w:t>的作用最局部，它可以补充被卡片挡住的连线，但不能减少节点、字段或候选数量。</w:t>
-      </w:r>
-    </w:p>
-    <w:p>
-      <w:pPr>
-        <w:jc w:val="both"/>
-        <w:rPr>
-          <w:lang w:eastAsia="zh-CN"/>
-        </w:rPr>
-      </w:pPr>
-      <w:r>
-        <w:rPr>
-          <w:lang w:eastAsia="zh-CN"/>
-        </w:rPr>
-        <w:t>综合来看，</w:t>
-      </w:r>
-      <w:r>
-        <w:rPr>
-          <w:lang w:eastAsia="zh-CN"/>
-        </w:rPr>
-        <w:t xml:space="preserve">Adaptive </w:t>
-      </w:r>
-      <w:r>
-        <w:rPr>
-          <w:lang w:eastAsia="zh-CN"/>
-        </w:rPr>
-        <w:t>适合作为概览基础，</w:t>
-      </w:r>
-      <w:r>
-        <w:rPr>
-          <w:lang w:eastAsia="zh-CN"/>
-        </w:rPr>
-        <w:t xml:space="preserve">Smart </w:t>
-      </w:r>
-      <w:r>
-        <w:rPr>
-          <w:lang w:eastAsia="zh-CN"/>
-        </w:rPr>
-        <w:t>和</w:t>
-      </w:r>
-      <w:r>
-        <w:rPr>
-          <w:lang w:eastAsia="zh-CN"/>
-        </w:rPr>
-        <w:t xml:space="preserve"> Related </w:t>
-      </w:r>
-      <w:r>
-        <w:rPr>
-          <w:lang w:eastAsia="zh-CN"/>
-        </w:rPr>
-        <w:t>分别服务编辑与结构检查，</w:t>
-      </w:r>
-      <w:r>
-        <w:rPr>
-          <w:lang w:eastAsia="zh-CN"/>
-        </w:rPr>
-        <w:t xml:space="preserve">Fisheye </w:t>
-      </w:r>
-      <w:r>
-        <w:rPr>
-          <w:lang w:eastAsia="zh-CN"/>
-        </w:rPr>
-        <w:t>和</w:t>
-      </w:r>
-      <w:r>
-        <w:rPr>
-          <w:lang w:eastAsia="zh-CN"/>
-        </w:rPr>
-        <w:t xml:space="preserve"> Overlay </w:t>
-      </w:r>
-      <w:r>
-        <w:rPr>
-          <w:lang w:eastAsia="zh-CN"/>
-        </w:rPr>
-        <w:t>则在局部问题出现时使用。</w:t>
+        <w:t>项目中的</w:t>
+      </w:r>
+      <w:r>
+        <w:rPr>
+          <w:lang w:eastAsia="zh-CN"/>
+        </w:rPr>
+        <w:t>显示优化功能可以改善开发者的查看和编辑过程。</w:t>
+      </w:r>
+    </w:p>
+    <w:p>
+      <w:pPr>
+        <w:rPr>
+          <w:lang w:eastAsia="zh-CN"/>
+        </w:rPr>
+      </w:pPr>
+      <w:r>
+        <w:rPr>
+          <w:lang w:eastAsia="zh-CN"/>
+        </w:rPr>
+        <w:br w:type="page"/>
       </w:r>
     </w:p>
     <w:p>
@@ -19414,245 +20136,11 @@
           <w:lang w:eastAsia="zh-CN"/>
         </w:rPr>
       </w:pPr>
-      <w:bookmarkStart w:id="70" w:name="_Toc238830676"/>
-      <w:r>
-        <w:rPr>
-          <w:lang w:eastAsia="zh-CN"/>
-        </w:rPr>
-        <w:t>第</w:t>
-      </w:r>
-      <w:r>
-        <w:rPr>
-          <w:lang w:eastAsia="zh-CN"/>
-        </w:rPr>
-        <w:t>7</w:t>
-      </w:r>
-      <w:r>
-        <w:rPr>
-          <w:lang w:eastAsia="zh-CN"/>
-        </w:rPr>
-        <w:t>章　结论</w:t>
-      </w:r>
-      <w:bookmarkEnd w:id="70"/>
-    </w:p>
-    <w:p>
-      <w:pPr>
-        <w:jc w:val="both"/>
-        <w:rPr>
-          <w:lang w:eastAsia="zh-CN"/>
-        </w:rPr>
-      </w:pPr>
-      <w:r>
-        <w:rPr>
-          <w:lang w:eastAsia="zh-CN"/>
-        </w:rPr>
-        <w:t>本项目完成了一个可以编辑、保存、运行和调试的</w:t>
-      </w:r>
-      <w:r>
-        <w:rPr>
-          <w:lang w:eastAsia="zh-CN"/>
-        </w:rPr>
-        <w:t xml:space="preserve"> Godot 4.6 </w:t>
-      </w:r>
-      <w:r>
-        <w:rPr>
-          <w:lang w:eastAsia="zh-CN"/>
-        </w:rPr>
-        <w:t>行为树插件，并用它研究大型行为树的显示问题。当前</w:t>
-      </w:r>
-      <w:r>
-        <w:rPr>
-          <w:rFonts w:hint="eastAsia"/>
-          <w:lang w:eastAsia="zh-CN"/>
-        </w:rPr>
-        <w:t>显示优化功能</w:t>
-      </w:r>
-      <w:r>
-        <w:rPr>
-          <w:lang w:eastAsia="zh-CN"/>
-        </w:rPr>
-        <w:t>包含智能拖拽重排、自适应缩放细节、可读连线覆盖、相关节点聚焦和鱼眼聚焦。实验使用五棵真实游戏树和三种来自实际设备的屏幕尺寸配置。</w:t>
-      </w:r>
-    </w:p>
-    <w:p>
-      <w:pPr>
-        <w:jc w:val="both"/>
-        <w:rPr>
-          <w:lang w:eastAsia="zh-CN"/>
-        </w:rPr>
-      </w:pPr>
-      <w:r>
-        <w:rPr>
-          <w:lang w:eastAsia="zh-CN"/>
-        </w:rPr>
-        <w:t>表</w:t>
-      </w:r>
-      <w:r>
-        <w:rPr>
-          <w:lang w:eastAsia="zh-CN"/>
-        </w:rPr>
-        <w:t xml:space="preserve"> 5.2 </w:t>
-      </w:r>
-      <w:r>
-        <w:rPr>
-          <w:lang w:eastAsia="zh-CN"/>
-        </w:rPr>
-        <w:t>至表</w:t>
-      </w:r>
-      <w:r>
-        <w:rPr>
-          <w:lang w:eastAsia="zh-CN"/>
-        </w:rPr>
-        <w:t xml:space="preserve"> 5.4 </w:t>
-      </w:r>
-      <w:r>
-        <w:rPr>
-          <w:lang w:eastAsia="zh-CN"/>
-        </w:rPr>
-        <w:t>显示，各项显示优化功能都产生了各自针对的变化，而且没有改变树结构和执行顺序。</w:t>
-      </w:r>
-      <w:r>
-        <w:rPr>
-          <w:lang w:eastAsia="zh-CN"/>
-        </w:rPr>
-        <w:t xml:space="preserve">Smart </w:t>
-      </w:r>
-      <w:r>
-        <w:rPr>
-          <w:lang w:eastAsia="zh-CN"/>
-        </w:rPr>
-        <w:t>适合处理拖动产生的遮挡，</w:t>
-      </w:r>
-      <w:r>
-        <w:rPr>
-          <w:lang w:eastAsia="zh-CN"/>
-        </w:rPr>
-        <w:t xml:space="preserve">Adaptive </w:t>
-      </w:r>
-      <w:r>
-        <w:rPr>
-          <w:lang w:eastAsia="zh-CN"/>
-        </w:rPr>
-        <w:t>适合持续查看整棵树，</w:t>
-      </w:r>
-      <w:r>
-        <w:rPr>
-          <w:lang w:eastAsia="zh-CN"/>
-        </w:rPr>
-        <w:t xml:space="preserve">Related </w:t>
-      </w:r>
-      <w:r>
-        <w:rPr>
-          <w:lang w:eastAsia="zh-CN"/>
-        </w:rPr>
-        <w:t>适合检查选中节点的结构关系。修改后的鱼眼在小屏和大型树上提供了更强的局部放大，但也带来了更多遮挡。</w:t>
-      </w:r>
-      <w:r>
-        <w:rPr>
-          <w:lang w:eastAsia="zh-CN"/>
-        </w:rPr>
-        <w:t xml:space="preserve">Overlay </w:t>
-      </w:r>
-      <w:r>
-        <w:rPr>
-          <w:lang w:eastAsia="zh-CN"/>
-        </w:rPr>
-        <w:t>则只处理特定连线被卡片挡住的情况。</w:t>
-      </w:r>
-    </w:p>
-    <w:p>
-      <w:pPr>
-        <w:jc w:val="both"/>
-        <w:rPr>
-          <w:lang w:eastAsia="zh-CN"/>
-        </w:rPr>
-      </w:pPr>
-      <w:r>
-        <w:rPr>
-          <w:lang w:eastAsia="zh-CN"/>
-        </w:rPr>
-        <w:t>因此，研究问题可以得到有条件的肯定回答：这些功能能够改善它们各自针对的可测显示或编辑状态，但没有一项在所有规模、屏幕和任务中都最好。总体上，</w:t>
-      </w:r>
-      <w:r>
-        <w:rPr>
-          <w:lang w:eastAsia="zh-CN"/>
-        </w:rPr>
-        <w:t xml:space="preserve">Adaptive </w:t>
-      </w:r>
-      <w:r>
-        <w:rPr>
-          <w:lang w:eastAsia="zh-CN"/>
-        </w:rPr>
-        <w:t>最适合作为通用功能，</w:t>
-      </w:r>
-      <w:r>
-        <w:rPr>
-          <w:lang w:eastAsia="zh-CN"/>
-        </w:rPr>
-        <w:t xml:space="preserve">Smart </w:t>
-      </w:r>
-      <w:r>
-        <w:rPr>
-          <w:lang w:eastAsia="zh-CN"/>
-        </w:rPr>
-        <w:t>和</w:t>
-      </w:r>
-      <w:r>
-        <w:rPr>
-          <w:lang w:eastAsia="zh-CN"/>
-        </w:rPr>
-        <w:t xml:space="preserve"> Related </w:t>
-      </w:r>
-      <w:r>
-        <w:rPr>
-          <w:lang w:eastAsia="zh-CN"/>
-        </w:rPr>
-        <w:t>分别适合编辑与结构检查，</w:t>
-      </w:r>
-      <w:r>
-        <w:rPr>
-          <w:lang w:eastAsia="zh-CN"/>
-        </w:rPr>
-        <w:t xml:space="preserve">Fisheye </w:t>
-      </w:r>
-      <w:r>
-        <w:rPr>
-          <w:lang w:eastAsia="zh-CN"/>
-        </w:rPr>
-        <w:t>和</w:t>
-      </w:r>
-      <w:r>
-        <w:rPr>
-          <w:lang w:eastAsia="zh-CN"/>
-        </w:rPr>
-        <w:t xml:space="preserve"> Overlay </w:t>
-      </w:r>
-      <w:r>
-        <w:rPr>
-          <w:lang w:eastAsia="zh-CN"/>
-        </w:rPr>
-        <w:t>更适合按需使用。</w:t>
-      </w:r>
-    </w:p>
-    <w:p>
-      <w:pPr>
-        <w:rPr>
-          <w:lang w:eastAsia="zh-CN"/>
-        </w:rPr>
-      </w:pPr>
-      <w:r>
-        <w:rPr>
-          <w:lang w:eastAsia="zh-CN"/>
-        </w:rPr>
-        <w:br w:type="page"/>
-      </w:r>
-    </w:p>
-    <w:p>
-      <w:pPr>
-        <w:pStyle w:val="1"/>
-      </w:pPr>
       <w:bookmarkStart w:id="71" w:name="_Toc238830677"/>
       <w:r>
+        <w:rPr>
+          <w:lang w:eastAsia="zh-CN"/>
+        </w:rPr>
         <w:lastRenderedPageBreak/>
         <w:t>参考文献</w:t>
       </w:r>
@@ -19663,16 +20151,26 @@
         <w:jc w:val="both"/>
       </w:pPr>
       <w:r>
+        <w:rPr>
+          <w:lang w:eastAsia="zh-CN"/>
+        </w:rPr>
         <w:t xml:space="preserve">Archambault, D. and Purchase, H. C. (2013) ‘The “Map” in the Mental Map: Experimental Results in Dynamic Graph Drawing’, </w:t>
       </w:r>
       <w:r>
         <w:rPr>
           <w:i/>
+          <w:lang w:eastAsia="zh-CN"/>
         </w:rPr>
         <w:t>International Journal of Human-Computer Studies</w:t>
       </w:r>
       <w:r>
-        <w:t xml:space="preserve">, 71(11), pp. 1044–1055. Available at: </w:t>
+        <w:rPr>
+          <w:lang w:eastAsia="zh-CN"/>
+        </w:rPr>
+        <w:t xml:space="preserve">, 71(11), pp. 1044–1055. </w:t>
+      </w:r>
+      <w:r>
+        <w:t xml:space="preserve">Available at: </w:t>
       </w:r>
       <w:hyperlink r:id="rId19">
         <w:r>
@@ -20923,7 +21421,7 @@
   <w:abstractNum w:abstractNumId="8" w15:restartNumberingAfterBreak="0">
     <w:nsid w:val="FFFFFF89"/>
     <w:multiLevelType w:val="singleLevel"/>
-    <w:tmpl w:val="490CD5A0"/>
+    <w:tmpl w:val="047C833C"/>
     <w:lvl w:ilvl="0">
       <w:start w:val="1"/>
       <w:numFmt w:val="bullet"/>
@@ -21586,7 +22084,6 @@
   <w:style w:type="character" w:default="1" w:styleId="a2">
     <w:name w:val="Default Paragraph Font"/>
     <w:uiPriority w:val="1"/>
-    <w:semiHidden/>
     <w:unhideWhenUsed/>
   </w:style>
   <w:style w:type="table" w:default="1" w:styleId="a3">

</xml_diff>